<commit_message>
Revise Bonus Assignment 1: complex sentences covering all PP modification positions
New sentences demonstrate PP modifying N (subject head), N (object of prep via
nested PP), V (adverbial), ADJ (inside ADJP), and ADV (inside ADVP). Added
long NP and long VP examples. Updated diagrams, .md source files, and .docx files.

Co-Authored-By: Claude Sonnet 4.6 <noreply@anthropic.com>
</commit_message>
<xml_diff>
--- a/Homework/Exams/ENGL 3110 - S26 - Bonus Assignment.docx
+++ b/Homework/Exams/ENGL 3110 - S26 - Bonus Assignment.docx
@@ -590,7 +590,7 @@
           <w:i/>
           <w:sz w:val="22"/>
         </w:rPr>
-        <w:t>The tall student slept quietly in the library.</w:t>
+        <w:t>The tall energetic student near the door arrived late.</w:t>
       </w:r>
     </w:p>
     <w:tbl>
@@ -601,20 +601,21 @@
         <w:tblLook w:firstColumn="1" w:firstRow="1" w:lastColumn="0" w:lastRow="0" w:noHBand="0" w:noVBand="1" w:val="04A0"/>
       </w:tblPr>
       <w:tblGrid>
-        <w:gridCol w:w="960"/>
-        <w:gridCol w:w="960"/>
-        <w:gridCol w:w="960"/>
-        <w:gridCol w:w="960"/>
-        <w:gridCol w:w="960"/>
-        <w:gridCol w:w="960"/>
-        <w:gridCol w:w="960"/>
-        <w:gridCol w:w="960"/>
-        <w:gridCol w:w="960"/>
+        <w:gridCol w:w="864"/>
+        <w:gridCol w:w="864"/>
+        <w:gridCol w:w="864"/>
+        <w:gridCol w:w="864"/>
+        <w:gridCol w:w="864"/>
+        <w:gridCol w:w="864"/>
+        <w:gridCol w:w="864"/>
+        <w:gridCol w:w="864"/>
+        <w:gridCol w:w="864"/>
+        <w:gridCol w:w="864"/>
       </w:tblGrid>
       <w:tr>
         <w:tc>
           <w:tcPr>
-            <w:tcW w:type="dxa" w:w="960"/>
+            <w:tcW w:type="dxa" w:w="864"/>
             <w:shd w:fill="E8E8E8" w:val="clear"/>
           </w:tcPr>
           <w:p>
@@ -633,8 +634,8 @@
         </w:tc>
         <w:tc>
           <w:tcPr>
-            <w:tcW w:type="dxa" w:w="2880"/>
-            <w:gridSpan w:val="3"/>
+            <w:tcW w:type="dxa" w:w="6048"/>
+            <w:gridSpan w:val="7"/>
           </w:tcPr>
           <w:p>
             <w:pPr>
@@ -651,8 +652,8 @@
         </w:tc>
         <w:tc>
           <w:tcPr>
-            <w:tcW w:type="dxa" w:w="4800"/>
-            <w:gridSpan w:val="5"/>
+            <w:tcW w:type="dxa" w:w="1728"/>
+            <w:gridSpan w:val="2"/>
           </w:tcPr>
           <w:p>
             <w:pPr>
@@ -671,7 +672,7 @@
       <w:tr>
         <w:tc>
           <w:tcPr>
-            <w:tcW w:type="dxa" w:w="960"/>
+            <w:tcW w:type="dxa" w:w="864"/>
             <w:shd w:fill="E8E8E8" w:val="clear"/>
           </w:tcPr>
           <w:p>
@@ -690,8 +691,8 @@
         </w:tc>
         <w:tc>
           <w:tcPr>
-            <w:tcW w:type="dxa" w:w="2880"/>
-            <w:gridSpan w:val="3"/>
+            <w:tcW w:type="dxa" w:w="3456"/>
+            <w:gridSpan w:val="4"/>
           </w:tcPr>
           <w:p>
             <w:pPr>
@@ -708,7 +709,8 @@
         </w:tc>
         <w:tc>
           <w:tcPr>
-            <w:tcW w:type="dxa" w:w="960"/>
+            <w:tcW w:type="dxa" w:w="2592"/>
+            <w:gridSpan w:val="3"/>
           </w:tcPr>
           <w:p>
             <w:pPr>
@@ -725,7 +727,7 @@
         </w:tc>
         <w:tc>
           <w:tcPr>
-            <w:tcW w:type="dxa" w:w="960"/>
+            <w:tcW w:type="dxa" w:w="864"/>
           </w:tcPr>
           <w:p>
             <w:pPr>
@@ -742,8 +744,7 @@
         </w:tc>
         <w:tc>
           <w:tcPr>
-            <w:tcW w:type="dxa" w:w="2880"/>
-            <w:gridSpan w:val="3"/>
+            <w:tcW w:type="dxa" w:w="864"/>
           </w:tcPr>
           <w:p>
             <w:pPr>
@@ -762,7 +763,7 @@
       <w:tr>
         <w:tc>
           <w:tcPr>
-            <w:tcW w:type="dxa" w:w="960"/>
+            <w:tcW w:type="dxa" w:w="864"/>
             <w:shd w:fill="E8E8E8" w:val="clear"/>
           </w:tcPr>
           <w:p>
@@ -781,7 +782,7 @@
         </w:tc>
         <w:tc>
           <w:tcPr>
-            <w:tcW w:type="dxa" w:w="960"/>
+            <w:tcW w:type="dxa" w:w="864"/>
           </w:tcPr>
           <w:p>
             <w:pPr>
@@ -798,7 +799,7 @@
         </w:tc>
         <w:tc>
           <w:tcPr>
-            <w:tcW w:type="dxa" w:w="960"/>
+            <w:tcW w:type="dxa" w:w="864"/>
           </w:tcPr>
           <w:p>
             <w:pPr>
@@ -815,7 +816,24 @@
         </w:tc>
         <w:tc>
           <w:tcPr>
-            <w:tcW w:type="dxa" w:w="960"/>
+            <w:tcW w:type="dxa" w:w="864"/>
+          </w:tcPr>
+          <w:p>
+            <w:pPr>
+              <w:jc w:val="center"/>
+            </w:pPr>
+            <w:r/>
+            <w:r>
+              <w:rPr>
+                <w:sz w:val="20"/>
+              </w:rPr>
+              <w:t>energetic</w:t>
+            </w:r>
+          </w:p>
+        </w:tc>
+        <w:tc>
+          <w:tcPr>
+            <w:tcW w:type="dxa" w:w="864"/>
           </w:tcPr>
           <w:p>
             <w:pPr>
@@ -832,7 +850,7 @@
         </w:tc>
         <w:tc>
           <w:tcPr>
-            <w:tcW w:type="dxa" w:w="960"/>
+            <w:tcW w:type="dxa" w:w="864"/>
           </w:tcPr>
           <w:p>
             <w:pPr>
@@ -843,47 +861,13 @@
               <w:rPr>
                 <w:sz w:val="20"/>
               </w:rPr>
-              <w:t>slept</w:t>
+              <w:t>near</w:t>
             </w:r>
           </w:p>
         </w:tc>
         <w:tc>
           <w:tcPr>
-            <w:tcW w:type="dxa" w:w="960"/>
-          </w:tcPr>
-          <w:p>
-            <w:pPr>
-              <w:jc w:val="center"/>
-            </w:pPr>
-            <w:r/>
-            <w:r>
-              <w:rPr>
-                <w:sz w:val="20"/>
-              </w:rPr>
-              <w:t>quietly</w:t>
-            </w:r>
-          </w:p>
-        </w:tc>
-        <w:tc>
-          <w:tcPr>
-            <w:tcW w:type="dxa" w:w="960"/>
-          </w:tcPr>
-          <w:p>
-            <w:pPr>
-              <w:jc w:val="center"/>
-            </w:pPr>
-            <w:r/>
-            <w:r>
-              <w:rPr>
-                <w:sz w:val="20"/>
-              </w:rPr>
-              <w:t>in</w:t>
-            </w:r>
-          </w:p>
-        </w:tc>
-        <w:tc>
-          <w:tcPr>
-            <w:tcW w:type="dxa" w:w="960"/>
+            <w:tcW w:type="dxa" w:w="864"/>
           </w:tcPr>
           <w:p>
             <w:pPr>
@@ -900,7 +884,7 @@
         </w:tc>
         <w:tc>
           <w:tcPr>
-            <w:tcW w:type="dxa" w:w="960"/>
+            <w:tcW w:type="dxa" w:w="864"/>
           </w:tcPr>
           <w:p>
             <w:pPr>
@@ -911,7 +895,41 @@
               <w:rPr>
                 <w:sz w:val="20"/>
               </w:rPr>
-              <w:t>library</w:t>
+              <w:t>door</w:t>
+            </w:r>
+          </w:p>
+        </w:tc>
+        <w:tc>
+          <w:tcPr>
+            <w:tcW w:type="dxa" w:w="864"/>
+          </w:tcPr>
+          <w:p>
+            <w:pPr>
+              <w:jc w:val="center"/>
+            </w:pPr>
+            <w:r/>
+            <w:r>
+              <w:rPr>
+                <w:sz w:val="20"/>
+              </w:rPr>
+              <w:t>arrived</w:t>
+            </w:r>
+          </w:p>
+        </w:tc>
+        <w:tc>
+          <w:tcPr>
+            <w:tcW w:type="dxa" w:w="864"/>
+          </w:tcPr>
+          <w:p>
+            <w:pPr>
+              <w:jc w:val="center"/>
+            </w:pPr>
+            <w:r/>
+            <w:r>
+              <w:rPr>
+                <w:sz w:val="20"/>
+              </w:rPr>
+              <w:t>late</w:t>
             </w:r>
           </w:p>
         </w:tc>
@@ -919,7 +937,7 @@
       <w:tr>
         <w:tc>
           <w:tcPr>
-            <w:tcW w:type="dxa" w:w="960"/>
+            <w:tcW w:type="dxa" w:w="864"/>
             <w:shd w:fill="E8E8E8" w:val="clear"/>
           </w:tcPr>
           <w:p>
@@ -938,7 +956,7 @@
         </w:tc>
         <w:tc>
           <w:tcPr>
-            <w:tcW w:type="dxa" w:w="960"/>
+            <w:tcW w:type="dxa" w:w="864"/>
           </w:tcPr>
           <w:p>
             <w:pPr>
@@ -949,7 +967,7 @@
         </w:tc>
         <w:tc>
           <w:tcPr>
-            <w:tcW w:type="dxa" w:w="960"/>
+            <w:tcW w:type="dxa" w:w="864"/>
           </w:tcPr>
           <w:p>
             <w:pPr>
@@ -960,7 +978,7 @@
         </w:tc>
         <w:tc>
           <w:tcPr>
-            <w:tcW w:type="dxa" w:w="960"/>
+            <w:tcW w:type="dxa" w:w="864"/>
           </w:tcPr>
           <w:p>
             <w:pPr>
@@ -971,7 +989,7 @@
         </w:tc>
         <w:tc>
           <w:tcPr>
-            <w:tcW w:type="dxa" w:w="960"/>
+            <w:tcW w:type="dxa" w:w="864"/>
           </w:tcPr>
           <w:p>
             <w:pPr>
@@ -982,7 +1000,7 @@
         </w:tc>
         <w:tc>
           <w:tcPr>
-            <w:tcW w:type="dxa" w:w="960"/>
+            <w:tcW w:type="dxa" w:w="864"/>
           </w:tcPr>
           <w:p>
             <w:pPr>
@@ -993,7 +1011,7 @@
         </w:tc>
         <w:tc>
           <w:tcPr>
-            <w:tcW w:type="dxa" w:w="960"/>
+            <w:tcW w:type="dxa" w:w="864"/>
           </w:tcPr>
           <w:p>
             <w:pPr>
@@ -1004,7 +1022,7 @@
         </w:tc>
         <w:tc>
           <w:tcPr>
-            <w:tcW w:type="dxa" w:w="960"/>
+            <w:tcW w:type="dxa" w:w="864"/>
           </w:tcPr>
           <w:p>
             <w:pPr>
@@ -1015,7 +1033,18 @@
         </w:tc>
         <w:tc>
           <w:tcPr>
-            <w:tcW w:type="dxa" w:w="960"/>
+            <w:tcW w:type="dxa" w:w="864"/>
+          </w:tcPr>
+          <w:p>
+            <w:pPr>
+              <w:jc w:val="center"/>
+            </w:pPr>
+            <w:r/>
+          </w:p>
+        </w:tc>
+        <w:tc>
+          <w:tcPr>
+            <w:tcW w:type="dxa" w:w="864"/>
           </w:tcPr>
           <w:p>
             <w:pPr>
@@ -1110,7 +1139,7 @@
           <w:i/>
           <w:sz w:val="22"/>
         </w:rPr>
-        <w:t>The young children played happily in the yard.</w:t>
+        <w:t>The brilliant young professor from the northern campus spoke clearly.</w:t>
       </w:r>
     </w:p>
     <w:tbl>
@@ -1121,20 +1150,22 @@
         <w:tblLook w:firstColumn="1" w:firstRow="1" w:lastColumn="0" w:lastRow="0" w:noHBand="0" w:noVBand="1" w:val="04A0"/>
       </w:tblPr>
       <w:tblGrid>
-        <w:gridCol w:w="960"/>
-        <w:gridCol w:w="960"/>
-        <w:gridCol w:w="960"/>
-        <w:gridCol w:w="960"/>
-        <w:gridCol w:w="960"/>
-        <w:gridCol w:w="960"/>
-        <w:gridCol w:w="960"/>
-        <w:gridCol w:w="960"/>
-        <w:gridCol w:w="960"/>
+        <w:gridCol w:w="785"/>
+        <w:gridCol w:w="785"/>
+        <w:gridCol w:w="785"/>
+        <w:gridCol w:w="785"/>
+        <w:gridCol w:w="785"/>
+        <w:gridCol w:w="785"/>
+        <w:gridCol w:w="785"/>
+        <w:gridCol w:w="785"/>
+        <w:gridCol w:w="785"/>
+        <w:gridCol w:w="785"/>
+        <w:gridCol w:w="785"/>
       </w:tblGrid>
       <w:tr>
         <w:tc>
           <w:tcPr>
-            <w:tcW w:type="dxa" w:w="960"/>
+            <w:tcW w:type="dxa" w:w="785"/>
             <w:shd w:fill="E8E8E8" w:val="clear"/>
           </w:tcPr>
           <w:p>
@@ -1153,8 +1184,8 @@
         </w:tc>
         <w:tc>
           <w:tcPr>
-            <w:tcW w:type="dxa" w:w="2880"/>
-            <w:gridSpan w:val="3"/>
+            <w:tcW w:type="dxa" w:w="6280"/>
+            <w:gridSpan w:val="8"/>
           </w:tcPr>
           <w:p>
             <w:pPr>
@@ -1171,8 +1202,8 @@
         </w:tc>
         <w:tc>
           <w:tcPr>
-            <w:tcW w:type="dxa" w:w="4800"/>
-            <w:gridSpan w:val="5"/>
+            <w:tcW w:type="dxa" w:w="1570"/>
+            <w:gridSpan w:val="2"/>
           </w:tcPr>
           <w:p>
             <w:pPr>
@@ -1191,7 +1222,7 @@
       <w:tr>
         <w:tc>
           <w:tcPr>
-            <w:tcW w:type="dxa" w:w="960"/>
+            <w:tcW w:type="dxa" w:w="785"/>
             <w:shd w:fill="E8E8E8" w:val="clear"/>
           </w:tcPr>
           <w:p>
@@ -1210,8 +1241,8 @@
         </w:tc>
         <w:tc>
           <w:tcPr>
-            <w:tcW w:type="dxa" w:w="2880"/>
-            <w:gridSpan w:val="3"/>
+            <w:tcW w:type="dxa" w:w="3140"/>
+            <w:gridSpan w:val="4"/>
           </w:tcPr>
           <w:p>
             <w:pPr>
@@ -1228,7 +1259,8 @@
         </w:tc>
         <w:tc>
           <w:tcPr>
-            <w:tcW w:type="dxa" w:w="960"/>
+            <w:tcW w:type="dxa" w:w="3140"/>
+            <w:gridSpan w:val="4"/>
           </w:tcPr>
           <w:p>
             <w:pPr>
@@ -1245,7 +1277,7 @@
         </w:tc>
         <w:tc>
           <w:tcPr>
-            <w:tcW w:type="dxa" w:w="960"/>
+            <w:tcW w:type="dxa" w:w="785"/>
           </w:tcPr>
           <w:p>
             <w:pPr>
@@ -1262,8 +1294,7 @@
         </w:tc>
         <w:tc>
           <w:tcPr>
-            <w:tcW w:type="dxa" w:w="2880"/>
-            <w:gridSpan w:val="3"/>
+            <w:tcW w:type="dxa" w:w="785"/>
           </w:tcPr>
           <w:p>
             <w:pPr>
@@ -1282,7 +1313,7 @@
       <w:tr>
         <w:tc>
           <w:tcPr>
-            <w:tcW w:type="dxa" w:w="960"/>
+            <w:tcW w:type="dxa" w:w="785"/>
             <w:shd w:fill="E8E8E8" w:val="clear"/>
           </w:tcPr>
           <w:p>
@@ -1301,7 +1332,7 @@
         </w:tc>
         <w:tc>
           <w:tcPr>
-            <w:tcW w:type="dxa" w:w="960"/>
+            <w:tcW w:type="dxa" w:w="785"/>
           </w:tcPr>
           <w:p>
             <w:pPr>
@@ -1318,7 +1349,24 @@
         </w:tc>
         <w:tc>
           <w:tcPr>
-            <w:tcW w:type="dxa" w:w="960"/>
+            <w:tcW w:type="dxa" w:w="785"/>
+          </w:tcPr>
+          <w:p>
+            <w:pPr>
+              <w:jc w:val="center"/>
+            </w:pPr>
+            <w:r/>
+            <w:r>
+              <w:rPr>
+                <w:sz w:val="20"/>
+              </w:rPr>
+              <w:t>brilliant</w:t>
+            </w:r>
+          </w:p>
+        </w:tc>
+        <w:tc>
+          <w:tcPr>
+            <w:tcW w:type="dxa" w:w="785"/>
           </w:tcPr>
           <w:p>
             <w:pPr>
@@ -1335,7 +1383,7 @@
         </w:tc>
         <w:tc>
           <w:tcPr>
-            <w:tcW w:type="dxa" w:w="960"/>
+            <w:tcW w:type="dxa" w:w="785"/>
           </w:tcPr>
           <w:p>
             <w:pPr>
@@ -1346,13 +1394,13 @@
               <w:rPr>
                 <w:sz w:val="20"/>
               </w:rPr>
-              <w:t>children</w:t>
+              <w:t>professor</w:t>
             </w:r>
           </w:p>
         </w:tc>
         <w:tc>
           <w:tcPr>
-            <w:tcW w:type="dxa" w:w="960"/>
+            <w:tcW w:type="dxa" w:w="785"/>
           </w:tcPr>
           <w:p>
             <w:pPr>
@@ -1363,47 +1411,13 @@
               <w:rPr>
                 <w:sz w:val="20"/>
               </w:rPr>
-              <w:t>played</w:t>
+              <w:t>from</w:t>
             </w:r>
           </w:p>
         </w:tc>
         <w:tc>
           <w:tcPr>
-            <w:tcW w:type="dxa" w:w="960"/>
-          </w:tcPr>
-          <w:p>
-            <w:pPr>
-              <w:jc w:val="center"/>
-            </w:pPr>
-            <w:r/>
-            <w:r>
-              <w:rPr>
-                <w:sz w:val="20"/>
-              </w:rPr>
-              <w:t>happily</w:t>
-            </w:r>
-          </w:p>
-        </w:tc>
-        <w:tc>
-          <w:tcPr>
-            <w:tcW w:type="dxa" w:w="960"/>
-          </w:tcPr>
-          <w:p>
-            <w:pPr>
-              <w:jc w:val="center"/>
-            </w:pPr>
-            <w:r/>
-            <w:r>
-              <w:rPr>
-                <w:sz w:val="20"/>
-              </w:rPr>
-              <w:t>in</w:t>
-            </w:r>
-          </w:p>
-        </w:tc>
-        <w:tc>
-          <w:tcPr>
-            <w:tcW w:type="dxa" w:w="960"/>
+            <w:tcW w:type="dxa" w:w="785"/>
           </w:tcPr>
           <w:p>
             <w:pPr>
@@ -1420,7 +1434,7 @@
         </w:tc>
         <w:tc>
           <w:tcPr>
-            <w:tcW w:type="dxa" w:w="960"/>
+            <w:tcW w:type="dxa" w:w="785"/>
           </w:tcPr>
           <w:p>
             <w:pPr>
@@ -1431,7 +1445,58 @@
               <w:rPr>
                 <w:sz w:val="20"/>
               </w:rPr>
-              <w:t>yard</w:t>
+              <w:t>northern</w:t>
+            </w:r>
+          </w:p>
+        </w:tc>
+        <w:tc>
+          <w:tcPr>
+            <w:tcW w:type="dxa" w:w="785"/>
+          </w:tcPr>
+          <w:p>
+            <w:pPr>
+              <w:jc w:val="center"/>
+            </w:pPr>
+            <w:r/>
+            <w:r>
+              <w:rPr>
+                <w:sz w:val="20"/>
+              </w:rPr>
+              <w:t>campus</w:t>
+            </w:r>
+          </w:p>
+        </w:tc>
+        <w:tc>
+          <w:tcPr>
+            <w:tcW w:type="dxa" w:w="785"/>
+          </w:tcPr>
+          <w:p>
+            <w:pPr>
+              <w:jc w:val="center"/>
+            </w:pPr>
+            <w:r/>
+            <w:r>
+              <w:rPr>
+                <w:sz w:val="20"/>
+              </w:rPr>
+              <w:t>spoke</w:t>
+            </w:r>
+          </w:p>
+        </w:tc>
+        <w:tc>
+          <w:tcPr>
+            <w:tcW w:type="dxa" w:w="785"/>
+          </w:tcPr>
+          <w:p>
+            <w:pPr>
+              <w:jc w:val="center"/>
+            </w:pPr>
+            <w:r/>
+            <w:r>
+              <w:rPr>
+                <w:sz w:val="20"/>
+              </w:rPr>
+              <w:t>clearly</w:t>
             </w:r>
           </w:p>
         </w:tc>
@@ -1439,7 +1504,7 @@
       <w:tr>
         <w:tc>
           <w:tcPr>
-            <w:tcW w:type="dxa" w:w="960"/>
+            <w:tcW w:type="dxa" w:w="785"/>
             <w:shd w:fill="E8E8E8" w:val="clear"/>
           </w:tcPr>
           <w:p>
@@ -1458,7 +1523,7 @@
         </w:tc>
         <w:tc>
           <w:tcPr>
-            <w:tcW w:type="dxa" w:w="960"/>
+            <w:tcW w:type="dxa" w:w="785"/>
           </w:tcPr>
           <w:p>
             <w:pPr>
@@ -1469,7 +1534,7 @@
         </w:tc>
         <w:tc>
           <w:tcPr>
-            <w:tcW w:type="dxa" w:w="960"/>
+            <w:tcW w:type="dxa" w:w="785"/>
           </w:tcPr>
           <w:p>
             <w:pPr>
@@ -1480,7 +1545,7 @@
         </w:tc>
         <w:tc>
           <w:tcPr>
-            <w:tcW w:type="dxa" w:w="960"/>
+            <w:tcW w:type="dxa" w:w="785"/>
           </w:tcPr>
           <w:p>
             <w:pPr>
@@ -1491,7 +1556,7 @@
         </w:tc>
         <w:tc>
           <w:tcPr>
-            <w:tcW w:type="dxa" w:w="960"/>
+            <w:tcW w:type="dxa" w:w="785"/>
           </w:tcPr>
           <w:p>
             <w:pPr>
@@ -1502,7 +1567,7 @@
         </w:tc>
         <w:tc>
           <w:tcPr>
-            <w:tcW w:type="dxa" w:w="960"/>
+            <w:tcW w:type="dxa" w:w="785"/>
           </w:tcPr>
           <w:p>
             <w:pPr>
@@ -1513,7 +1578,7 @@
         </w:tc>
         <w:tc>
           <w:tcPr>
-            <w:tcW w:type="dxa" w:w="960"/>
+            <w:tcW w:type="dxa" w:w="785"/>
           </w:tcPr>
           <w:p>
             <w:pPr>
@@ -1524,7 +1589,7 @@
         </w:tc>
         <w:tc>
           <w:tcPr>
-            <w:tcW w:type="dxa" w:w="960"/>
+            <w:tcW w:type="dxa" w:w="785"/>
           </w:tcPr>
           <w:p>
             <w:pPr>
@@ -1535,7 +1600,29 @@
         </w:tc>
         <w:tc>
           <w:tcPr>
-            <w:tcW w:type="dxa" w:w="960"/>
+            <w:tcW w:type="dxa" w:w="785"/>
+          </w:tcPr>
+          <w:p>
+            <w:pPr>
+              <w:jc w:val="center"/>
+            </w:pPr>
+            <w:r/>
+          </w:p>
+        </w:tc>
+        <w:tc>
+          <w:tcPr>
+            <w:tcW w:type="dxa" w:w="785"/>
+          </w:tcPr>
+          <w:p>
+            <w:pPr>
+              <w:jc w:val="center"/>
+            </w:pPr>
+            <w:r/>
+          </w:p>
+        </w:tc>
+        <w:tc>
+          <w:tcPr>
+            <w:tcW w:type="dxa" w:w="785"/>
           </w:tcPr>
           <w:p>
             <w:pPr>
@@ -1630,7 +1717,7 @@
           <w:i/>
           <w:sz w:val="22"/>
         </w:rPr>
-        <w:t>She ran very quickly through the dark forest.</w:t>
+        <w:t>The student afraid of failure studied very diligently.</w:t>
       </w:r>
     </w:p>
     <w:tbl>
@@ -1673,7 +1760,8 @@
         </w:tc>
         <w:tc>
           <w:tcPr>
-            <w:tcW w:type="dxa" w:w="960"/>
+            <w:tcW w:type="dxa" w:w="4800"/>
+            <w:gridSpan w:val="5"/>
           </w:tcPr>
           <w:p>
             <w:pPr>
@@ -1690,8 +1778,8 @@
         </w:tc>
         <w:tc>
           <w:tcPr>
-            <w:tcW w:type="dxa" w:w="6720"/>
-            <w:gridSpan w:val="7"/>
+            <w:tcW w:type="dxa" w:w="2880"/>
+            <w:gridSpan w:val="3"/>
           </w:tcPr>
           <w:p>
             <w:pPr>
@@ -1729,7 +1817,8 @@
         </w:tc>
         <w:tc>
           <w:tcPr>
-            <w:tcW w:type="dxa" w:w="960"/>
+            <w:tcW w:type="dxa" w:w="1920"/>
+            <w:gridSpan w:val="2"/>
           </w:tcPr>
           <w:p>
             <w:pPr>
@@ -1746,7 +1835,8 @@
         </w:tc>
         <w:tc>
           <w:tcPr>
-            <w:tcW w:type="dxa" w:w="960"/>
+            <w:tcW w:type="dxa" w:w="2880"/>
+            <w:gridSpan w:val="3"/>
           </w:tcPr>
           <w:p>
             <w:pPr>
@@ -1763,8 +1853,7 @@
         </w:tc>
         <w:tc>
           <w:tcPr>
-            <w:tcW w:type="dxa" w:w="1920"/>
-            <w:gridSpan w:val="2"/>
+            <w:tcW w:type="dxa" w:w="960"/>
           </w:tcPr>
           <w:p>
             <w:pPr>
@@ -1781,8 +1870,8 @@
         </w:tc>
         <w:tc>
           <w:tcPr>
-            <w:tcW w:type="dxa" w:w="3840"/>
-            <w:gridSpan w:val="4"/>
+            <w:tcW w:type="dxa" w:w="1920"/>
+            <w:gridSpan w:val="2"/>
           </w:tcPr>
           <w:p>
             <w:pPr>
@@ -1831,7 +1920,7 @@
               <w:rPr>
                 <w:sz w:val="20"/>
               </w:rPr>
-              <w:t>She</w:t>
+              <w:t>The</w:t>
             </w:r>
           </w:p>
         </w:tc>
@@ -1848,7 +1937,75 @@
               <w:rPr>
                 <w:sz w:val="20"/>
               </w:rPr>
-              <w:t>ran</w:t>
+              <w:t>student</w:t>
+            </w:r>
+          </w:p>
+        </w:tc>
+        <w:tc>
+          <w:tcPr>
+            <w:tcW w:type="dxa" w:w="960"/>
+          </w:tcPr>
+          <w:p>
+            <w:pPr>
+              <w:jc w:val="center"/>
+            </w:pPr>
+            <w:r/>
+            <w:r>
+              <w:rPr>
+                <w:sz w:val="20"/>
+              </w:rPr>
+              <w:t>afraid</w:t>
+            </w:r>
+          </w:p>
+        </w:tc>
+        <w:tc>
+          <w:tcPr>
+            <w:tcW w:type="dxa" w:w="960"/>
+          </w:tcPr>
+          <w:p>
+            <w:pPr>
+              <w:jc w:val="center"/>
+            </w:pPr>
+            <w:r/>
+            <w:r>
+              <w:rPr>
+                <w:sz w:val="20"/>
+              </w:rPr>
+              <w:t>of</w:t>
+            </w:r>
+          </w:p>
+        </w:tc>
+        <w:tc>
+          <w:tcPr>
+            <w:tcW w:type="dxa" w:w="960"/>
+          </w:tcPr>
+          <w:p>
+            <w:pPr>
+              <w:jc w:val="center"/>
+            </w:pPr>
+            <w:r/>
+            <w:r>
+              <w:rPr>
+                <w:sz w:val="20"/>
+              </w:rPr>
+              <w:t>failure</w:t>
+            </w:r>
+          </w:p>
+        </w:tc>
+        <w:tc>
+          <w:tcPr>
+            <w:tcW w:type="dxa" w:w="960"/>
+          </w:tcPr>
+          <w:p>
+            <w:pPr>
+              <w:jc w:val="center"/>
+            </w:pPr>
+            <w:r/>
+            <w:r>
+              <w:rPr>
+                <w:sz w:val="20"/>
+              </w:rPr>
+              <w:t>studied</w:t>
             </w:r>
           </w:p>
         </w:tc>
@@ -1882,75 +2039,7 @@
               <w:rPr>
                 <w:sz w:val="20"/>
               </w:rPr>
-              <w:t>quickly</w:t>
-            </w:r>
-          </w:p>
-        </w:tc>
-        <w:tc>
-          <w:tcPr>
-            <w:tcW w:type="dxa" w:w="960"/>
-          </w:tcPr>
-          <w:p>
-            <w:pPr>
-              <w:jc w:val="center"/>
-            </w:pPr>
-            <w:r/>
-            <w:r>
-              <w:rPr>
-                <w:sz w:val="20"/>
-              </w:rPr>
-              <w:t>through</w:t>
-            </w:r>
-          </w:p>
-        </w:tc>
-        <w:tc>
-          <w:tcPr>
-            <w:tcW w:type="dxa" w:w="960"/>
-          </w:tcPr>
-          <w:p>
-            <w:pPr>
-              <w:jc w:val="center"/>
-            </w:pPr>
-            <w:r/>
-            <w:r>
-              <w:rPr>
-                <w:sz w:val="20"/>
-              </w:rPr>
-              <w:t>the</w:t>
-            </w:r>
-          </w:p>
-        </w:tc>
-        <w:tc>
-          <w:tcPr>
-            <w:tcW w:type="dxa" w:w="960"/>
-          </w:tcPr>
-          <w:p>
-            <w:pPr>
-              <w:jc w:val="center"/>
-            </w:pPr>
-            <w:r/>
-            <w:r>
-              <w:rPr>
-                <w:sz w:val="20"/>
-              </w:rPr>
-              <w:t>dark</w:t>
-            </w:r>
-          </w:p>
-        </w:tc>
-        <w:tc>
-          <w:tcPr>
-            <w:tcW w:type="dxa" w:w="960"/>
-          </w:tcPr>
-          <w:p>
-            <w:pPr>
-              <w:jc w:val="center"/>
-            </w:pPr>
-            <w:r/>
-            <w:r>
-              <w:rPr>
-                <w:sz w:val="20"/>
-              </w:rPr>
-              <w:t>forest</w:t>
+              <w:t>diligently</w:t>
             </w:r>
           </w:p>
         </w:tc>
@@ -2149,7 +2238,7 @@
           <w:i/>
           <w:sz w:val="22"/>
         </w:rPr>
-        <w:t>The old dog rested near the warm fireplace.</w:t>
+        <w:t>They lived quite far from the noisy old city.</w:t>
       </w:r>
     </w:p>
     <w:tbl>
@@ -2160,20 +2249,21 @@
         <w:tblLook w:firstColumn="1" w:firstRow="1" w:lastColumn="0" w:lastRow="0" w:noHBand="0" w:noVBand="1" w:val="04A0"/>
       </w:tblPr>
       <w:tblGrid>
-        <w:gridCol w:w="960"/>
-        <w:gridCol w:w="960"/>
-        <w:gridCol w:w="960"/>
-        <w:gridCol w:w="960"/>
-        <w:gridCol w:w="960"/>
-        <w:gridCol w:w="960"/>
-        <w:gridCol w:w="960"/>
-        <w:gridCol w:w="960"/>
-        <w:gridCol w:w="960"/>
+        <w:gridCol w:w="864"/>
+        <w:gridCol w:w="864"/>
+        <w:gridCol w:w="864"/>
+        <w:gridCol w:w="864"/>
+        <w:gridCol w:w="864"/>
+        <w:gridCol w:w="864"/>
+        <w:gridCol w:w="864"/>
+        <w:gridCol w:w="864"/>
+        <w:gridCol w:w="864"/>
+        <w:gridCol w:w="864"/>
       </w:tblGrid>
       <w:tr>
         <w:tc>
           <w:tcPr>
-            <w:tcW w:type="dxa" w:w="960"/>
+            <w:tcW w:type="dxa" w:w="864"/>
             <w:shd w:fill="E8E8E8" w:val="clear"/>
           </w:tcPr>
           <w:p>
@@ -2192,8 +2282,7 @@
         </w:tc>
         <w:tc>
           <w:tcPr>
-            <w:tcW w:type="dxa" w:w="2880"/>
-            <w:gridSpan w:val="3"/>
+            <w:tcW w:type="dxa" w:w="864"/>
           </w:tcPr>
           <w:p>
             <w:pPr>
@@ -2210,8 +2299,8 @@
         </w:tc>
         <w:tc>
           <w:tcPr>
-            <w:tcW w:type="dxa" w:w="4800"/>
-            <w:gridSpan w:val="5"/>
+            <w:tcW w:type="dxa" w:w="6912"/>
+            <w:gridSpan w:val="8"/>
           </w:tcPr>
           <w:p>
             <w:pPr>
@@ -2230,7 +2319,7 @@
       <w:tr>
         <w:tc>
           <w:tcPr>
-            <w:tcW w:type="dxa" w:w="960"/>
+            <w:tcW w:type="dxa" w:w="864"/>
             <w:shd w:fill="E8E8E8" w:val="clear"/>
           </w:tcPr>
           <w:p>
@@ -2249,8 +2338,7 @@
         </w:tc>
         <w:tc>
           <w:tcPr>
-            <w:tcW w:type="dxa" w:w="2880"/>
-            <w:gridSpan w:val="3"/>
+            <w:tcW w:type="dxa" w:w="864"/>
           </w:tcPr>
           <w:p>
             <w:pPr>
@@ -2267,7 +2355,7 @@
         </w:tc>
         <w:tc>
           <w:tcPr>
-            <w:tcW w:type="dxa" w:w="960"/>
+            <w:tcW w:type="dxa" w:w="864"/>
           </w:tcPr>
           <w:p>
             <w:pPr>
@@ -2284,8 +2372,8 @@
         </w:tc>
         <w:tc>
           <w:tcPr>
-            <w:tcW w:type="dxa" w:w="3840"/>
-            <w:gridSpan w:val="4"/>
+            <w:tcW w:type="dxa" w:w="6048"/>
+            <w:gridSpan w:val="7"/>
           </w:tcPr>
           <w:p>
             <w:pPr>
@@ -2304,7 +2392,7 @@
       <w:tr>
         <w:tc>
           <w:tcPr>
-            <w:tcW w:type="dxa" w:w="960"/>
+            <w:tcW w:type="dxa" w:w="864"/>
             <w:shd w:fill="E8E8E8" w:val="clear"/>
           </w:tcPr>
           <w:p>
@@ -2323,7 +2411,7 @@
         </w:tc>
         <w:tc>
           <w:tcPr>
-            <w:tcW w:type="dxa" w:w="960"/>
+            <w:tcW w:type="dxa" w:w="864"/>
           </w:tcPr>
           <w:p>
             <w:pPr>
@@ -2334,13 +2422,115 @@
               <w:rPr>
                 <w:sz w:val="20"/>
               </w:rPr>
-              <w:t>The</w:t>
+              <w:t>They</w:t>
             </w:r>
           </w:p>
         </w:tc>
         <w:tc>
           <w:tcPr>
-            <w:tcW w:type="dxa" w:w="960"/>
+            <w:tcW w:type="dxa" w:w="864"/>
+          </w:tcPr>
+          <w:p>
+            <w:pPr>
+              <w:jc w:val="center"/>
+            </w:pPr>
+            <w:r/>
+            <w:r>
+              <w:rPr>
+                <w:sz w:val="20"/>
+              </w:rPr>
+              <w:t>lived</w:t>
+            </w:r>
+          </w:p>
+        </w:tc>
+        <w:tc>
+          <w:tcPr>
+            <w:tcW w:type="dxa" w:w="864"/>
+          </w:tcPr>
+          <w:p>
+            <w:pPr>
+              <w:jc w:val="center"/>
+            </w:pPr>
+            <w:r/>
+            <w:r>
+              <w:rPr>
+                <w:sz w:val="20"/>
+              </w:rPr>
+              <w:t>quite</w:t>
+            </w:r>
+          </w:p>
+        </w:tc>
+        <w:tc>
+          <w:tcPr>
+            <w:tcW w:type="dxa" w:w="864"/>
+          </w:tcPr>
+          <w:p>
+            <w:pPr>
+              <w:jc w:val="center"/>
+            </w:pPr>
+            <w:r/>
+            <w:r>
+              <w:rPr>
+                <w:sz w:val="20"/>
+              </w:rPr>
+              <w:t>far</w:t>
+            </w:r>
+          </w:p>
+        </w:tc>
+        <w:tc>
+          <w:tcPr>
+            <w:tcW w:type="dxa" w:w="864"/>
+          </w:tcPr>
+          <w:p>
+            <w:pPr>
+              <w:jc w:val="center"/>
+            </w:pPr>
+            <w:r/>
+            <w:r>
+              <w:rPr>
+                <w:sz w:val="20"/>
+              </w:rPr>
+              <w:t>from</w:t>
+            </w:r>
+          </w:p>
+        </w:tc>
+        <w:tc>
+          <w:tcPr>
+            <w:tcW w:type="dxa" w:w="864"/>
+          </w:tcPr>
+          <w:p>
+            <w:pPr>
+              <w:jc w:val="center"/>
+            </w:pPr>
+            <w:r/>
+            <w:r>
+              <w:rPr>
+                <w:sz w:val="20"/>
+              </w:rPr>
+              <w:t>the</w:t>
+            </w:r>
+          </w:p>
+        </w:tc>
+        <w:tc>
+          <w:tcPr>
+            <w:tcW w:type="dxa" w:w="864"/>
+          </w:tcPr>
+          <w:p>
+            <w:pPr>
+              <w:jc w:val="center"/>
+            </w:pPr>
+            <w:r/>
+            <w:r>
+              <w:rPr>
+                <w:sz w:val="20"/>
+              </w:rPr>
+              <w:t>noisy</w:t>
+            </w:r>
+          </w:p>
+        </w:tc>
+        <w:tc>
+          <w:tcPr>
+            <w:tcW w:type="dxa" w:w="864"/>
           </w:tcPr>
           <w:p>
             <w:pPr>
@@ -2357,7 +2547,7 @@
         </w:tc>
         <w:tc>
           <w:tcPr>
-            <w:tcW w:type="dxa" w:w="960"/>
+            <w:tcW w:type="dxa" w:w="864"/>
           </w:tcPr>
           <w:p>
             <w:pPr>
@@ -2368,92 +2558,7 @@
               <w:rPr>
                 <w:sz w:val="20"/>
               </w:rPr>
-              <w:t>dog</w:t>
-            </w:r>
-          </w:p>
-        </w:tc>
-        <w:tc>
-          <w:tcPr>
-            <w:tcW w:type="dxa" w:w="960"/>
-          </w:tcPr>
-          <w:p>
-            <w:pPr>
-              <w:jc w:val="center"/>
-            </w:pPr>
-            <w:r/>
-            <w:r>
-              <w:rPr>
-                <w:sz w:val="20"/>
-              </w:rPr>
-              <w:t>rested</w:t>
-            </w:r>
-          </w:p>
-        </w:tc>
-        <w:tc>
-          <w:tcPr>
-            <w:tcW w:type="dxa" w:w="960"/>
-          </w:tcPr>
-          <w:p>
-            <w:pPr>
-              <w:jc w:val="center"/>
-            </w:pPr>
-            <w:r/>
-            <w:r>
-              <w:rPr>
-                <w:sz w:val="20"/>
-              </w:rPr>
-              <w:t>near</w:t>
-            </w:r>
-          </w:p>
-        </w:tc>
-        <w:tc>
-          <w:tcPr>
-            <w:tcW w:type="dxa" w:w="960"/>
-          </w:tcPr>
-          <w:p>
-            <w:pPr>
-              <w:jc w:val="center"/>
-            </w:pPr>
-            <w:r/>
-            <w:r>
-              <w:rPr>
-                <w:sz w:val="20"/>
-              </w:rPr>
-              <w:t>the</w:t>
-            </w:r>
-          </w:p>
-        </w:tc>
-        <w:tc>
-          <w:tcPr>
-            <w:tcW w:type="dxa" w:w="960"/>
-          </w:tcPr>
-          <w:p>
-            <w:pPr>
-              <w:jc w:val="center"/>
-            </w:pPr>
-            <w:r/>
-            <w:r>
-              <w:rPr>
-                <w:sz w:val="20"/>
-              </w:rPr>
-              <w:t>warm</w:t>
-            </w:r>
-          </w:p>
-        </w:tc>
-        <w:tc>
-          <w:tcPr>
-            <w:tcW w:type="dxa" w:w="960"/>
-          </w:tcPr>
-          <w:p>
-            <w:pPr>
-              <w:jc w:val="center"/>
-            </w:pPr>
-            <w:r/>
-            <w:r>
-              <w:rPr>
-                <w:sz w:val="20"/>
-              </w:rPr>
-              <w:t>fireplace</w:t>
+              <w:t>city</w:t>
             </w:r>
           </w:p>
         </w:tc>
@@ -2461,7 +2566,7 @@
       <w:tr>
         <w:tc>
           <w:tcPr>
-            <w:tcW w:type="dxa" w:w="960"/>
+            <w:tcW w:type="dxa" w:w="864"/>
             <w:shd w:fill="E8E8E8" w:val="clear"/>
           </w:tcPr>
           <w:p>
@@ -2480,7 +2585,7 @@
         </w:tc>
         <w:tc>
           <w:tcPr>
-            <w:tcW w:type="dxa" w:w="960"/>
+            <w:tcW w:type="dxa" w:w="864"/>
           </w:tcPr>
           <w:p>
             <w:pPr>
@@ -2491,7 +2596,7 @@
         </w:tc>
         <w:tc>
           <w:tcPr>
-            <w:tcW w:type="dxa" w:w="960"/>
+            <w:tcW w:type="dxa" w:w="864"/>
           </w:tcPr>
           <w:p>
             <w:pPr>
@@ -2502,7 +2607,7 @@
         </w:tc>
         <w:tc>
           <w:tcPr>
-            <w:tcW w:type="dxa" w:w="960"/>
+            <w:tcW w:type="dxa" w:w="864"/>
           </w:tcPr>
           <w:p>
             <w:pPr>
@@ -2513,7 +2618,7 @@
         </w:tc>
         <w:tc>
           <w:tcPr>
-            <w:tcW w:type="dxa" w:w="960"/>
+            <w:tcW w:type="dxa" w:w="864"/>
           </w:tcPr>
           <w:p>
             <w:pPr>
@@ -2524,7 +2629,7 @@
         </w:tc>
         <w:tc>
           <w:tcPr>
-            <w:tcW w:type="dxa" w:w="960"/>
+            <w:tcW w:type="dxa" w:w="864"/>
           </w:tcPr>
           <w:p>
             <w:pPr>
@@ -2535,7 +2640,7 @@
         </w:tc>
         <w:tc>
           <w:tcPr>
-            <w:tcW w:type="dxa" w:w="960"/>
+            <w:tcW w:type="dxa" w:w="864"/>
           </w:tcPr>
           <w:p>
             <w:pPr>
@@ -2546,7 +2651,7 @@
         </w:tc>
         <w:tc>
           <w:tcPr>
-            <w:tcW w:type="dxa" w:w="960"/>
+            <w:tcW w:type="dxa" w:w="864"/>
           </w:tcPr>
           <w:p>
             <w:pPr>
@@ -2557,7 +2662,18 @@
         </w:tc>
         <w:tc>
           <w:tcPr>
-            <w:tcW w:type="dxa" w:w="960"/>
+            <w:tcW w:type="dxa" w:w="864"/>
+          </w:tcPr>
+          <w:p>
+            <w:pPr>
+              <w:jc w:val="center"/>
+            </w:pPr>
+            <w:r/>
+          </w:p>
+        </w:tc>
+        <w:tc>
+          <w:tcPr>
+            <w:tcW w:type="dxa" w:w="864"/>
           </w:tcPr>
           <w:p>
             <w:pPr>
@@ -2652,7 +2768,7 @@
           <w:i/>
           <w:sz w:val="22"/>
         </w:rPr>
-        <w:t>The bright stars shone above the quiet town.</w:t>
+        <w:t>He waited quietly at the bench near the old fountain.</w:t>
       </w:r>
     </w:p>
     <w:tbl>
@@ -2663,20 +2779,22 @@
         <w:tblLook w:firstColumn="1" w:firstRow="1" w:lastColumn="0" w:lastRow="0" w:noHBand="0" w:noVBand="1" w:val="04A0"/>
       </w:tblPr>
       <w:tblGrid>
-        <w:gridCol w:w="960"/>
-        <w:gridCol w:w="960"/>
-        <w:gridCol w:w="960"/>
-        <w:gridCol w:w="960"/>
-        <w:gridCol w:w="960"/>
-        <w:gridCol w:w="960"/>
-        <w:gridCol w:w="960"/>
-        <w:gridCol w:w="960"/>
-        <w:gridCol w:w="960"/>
+        <w:gridCol w:w="785"/>
+        <w:gridCol w:w="785"/>
+        <w:gridCol w:w="785"/>
+        <w:gridCol w:w="785"/>
+        <w:gridCol w:w="785"/>
+        <w:gridCol w:w="785"/>
+        <w:gridCol w:w="785"/>
+        <w:gridCol w:w="785"/>
+        <w:gridCol w:w="785"/>
+        <w:gridCol w:w="785"/>
+        <w:gridCol w:w="785"/>
       </w:tblGrid>
       <w:tr>
         <w:tc>
           <w:tcPr>
-            <w:tcW w:type="dxa" w:w="960"/>
+            <w:tcW w:type="dxa" w:w="785"/>
             <w:shd w:fill="E8E8E8" w:val="clear"/>
           </w:tcPr>
           <w:p>
@@ -2695,8 +2813,7 @@
         </w:tc>
         <w:tc>
           <w:tcPr>
-            <w:tcW w:type="dxa" w:w="2880"/>
-            <w:gridSpan w:val="3"/>
+            <w:tcW w:type="dxa" w:w="785"/>
           </w:tcPr>
           <w:p>
             <w:pPr>
@@ -2713,8 +2830,8 @@
         </w:tc>
         <w:tc>
           <w:tcPr>
-            <w:tcW w:type="dxa" w:w="4800"/>
-            <w:gridSpan w:val="5"/>
+            <w:tcW w:type="dxa" w:w="7065"/>
+            <w:gridSpan w:val="9"/>
           </w:tcPr>
           <w:p>
             <w:pPr>
@@ -2733,7 +2850,7 @@
       <w:tr>
         <w:tc>
           <w:tcPr>
-            <w:tcW w:type="dxa" w:w="960"/>
+            <w:tcW w:type="dxa" w:w="785"/>
             <w:shd w:fill="E8E8E8" w:val="clear"/>
           </w:tcPr>
           <w:p>
@@ -2752,8 +2869,7 @@
         </w:tc>
         <w:tc>
           <w:tcPr>
-            <w:tcW w:type="dxa" w:w="2880"/>
-            <w:gridSpan w:val="3"/>
+            <w:tcW w:type="dxa" w:w="785"/>
           </w:tcPr>
           <w:p>
             <w:pPr>
@@ -2770,7 +2886,7 @@
         </w:tc>
         <w:tc>
           <w:tcPr>
-            <w:tcW w:type="dxa" w:w="960"/>
+            <w:tcW w:type="dxa" w:w="785"/>
           </w:tcPr>
           <w:p>
             <w:pPr>
@@ -2787,8 +2903,7 @@
         </w:tc>
         <w:tc>
           <w:tcPr>
-            <w:tcW w:type="dxa" w:w="3840"/>
-            <w:gridSpan w:val="4"/>
+            <w:tcW w:type="dxa" w:w="785"/>
           </w:tcPr>
           <w:p>
             <w:pPr>
@@ -2803,11 +2918,47 @@
             </w:r>
           </w:p>
         </w:tc>
+        <w:tc>
+          <w:tcPr>
+            <w:tcW w:type="dxa" w:w="2355"/>
+            <w:gridSpan w:val="3"/>
+          </w:tcPr>
+          <w:p>
+            <w:pPr>
+              <w:jc w:val="center"/>
+            </w:pPr>
+            <w:r/>
+            <w:r>
+              <w:rPr>
+                <w:sz w:val="20"/>
+              </w:rPr>
+              <w:t xml:space="preserve"> </w:t>
+            </w:r>
+          </w:p>
+        </w:tc>
+        <w:tc>
+          <w:tcPr>
+            <w:tcW w:type="dxa" w:w="3140"/>
+            <w:gridSpan w:val="4"/>
+          </w:tcPr>
+          <w:p>
+            <w:pPr>
+              <w:jc w:val="center"/>
+            </w:pPr>
+            <w:r/>
+            <w:r>
+              <w:rPr>
+                <w:sz w:val="20"/>
+              </w:rPr>
+              <w:t xml:space="preserve"> </w:t>
+            </w:r>
+          </w:p>
+        </w:tc>
       </w:tr>
       <w:tr>
         <w:tc>
           <w:tcPr>
-            <w:tcW w:type="dxa" w:w="960"/>
+            <w:tcW w:type="dxa" w:w="785"/>
             <w:shd w:fill="E8E8E8" w:val="clear"/>
           </w:tcPr>
           <w:p>
@@ -2826,7 +2977,7 @@
         </w:tc>
         <w:tc>
           <w:tcPr>
-            <w:tcW w:type="dxa" w:w="960"/>
+            <w:tcW w:type="dxa" w:w="785"/>
           </w:tcPr>
           <w:p>
             <w:pPr>
@@ -2837,13 +2988,13 @@
               <w:rPr>
                 <w:sz w:val="20"/>
               </w:rPr>
-              <w:t>The</w:t>
+              <w:t>He</w:t>
             </w:r>
           </w:p>
         </w:tc>
         <w:tc>
           <w:tcPr>
-            <w:tcW w:type="dxa" w:w="960"/>
+            <w:tcW w:type="dxa" w:w="785"/>
           </w:tcPr>
           <w:p>
             <w:pPr>
@@ -2854,13 +3005,13 @@
               <w:rPr>
                 <w:sz w:val="20"/>
               </w:rPr>
-              <w:t>bright</w:t>
+              <w:t>waited</w:t>
             </w:r>
           </w:p>
         </w:tc>
         <w:tc>
           <w:tcPr>
-            <w:tcW w:type="dxa" w:w="960"/>
+            <w:tcW w:type="dxa" w:w="785"/>
           </w:tcPr>
           <w:p>
             <w:pPr>
@@ -2871,13 +3022,13 @@
               <w:rPr>
                 <w:sz w:val="20"/>
               </w:rPr>
-              <w:t>stars</w:t>
+              <w:t>quietly</w:t>
             </w:r>
           </w:p>
         </w:tc>
         <w:tc>
           <w:tcPr>
-            <w:tcW w:type="dxa" w:w="960"/>
+            <w:tcW w:type="dxa" w:w="785"/>
           </w:tcPr>
           <w:p>
             <w:pPr>
@@ -2888,30 +3039,13 @@
               <w:rPr>
                 <w:sz w:val="20"/>
               </w:rPr>
-              <w:t>shone</w:t>
+              <w:t>at</w:t>
             </w:r>
           </w:p>
         </w:tc>
         <w:tc>
           <w:tcPr>
-            <w:tcW w:type="dxa" w:w="960"/>
-          </w:tcPr>
-          <w:p>
-            <w:pPr>
-              <w:jc w:val="center"/>
-            </w:pPr>
-            <w:r/>
-            <w:r>
-              <w:rPr>
-                <w:sz w:val="20"/>
-              </w:rPr>
-              <w:t>above</w:t>
-            </w:r>
-          </w:p>
-        </w:tc>
-        <w:tc>
-          <w:tcPr>
-            <w:tcW w:type="dxa" w:w="960"/>
+            <w:tcW w:type="dxa" w:w="785"/>
           </w:tcPr>
           <w:p>
             <w:pPr>
@@ -2928,7 +3062,7 @@
         </w:tc>
         <w:tc>
           <w:tcPr>
-            <w:tcW w:type="dxa" w:w="960"/>
+            <w:tcW w:type="dxa" w:w="785"/>
           </w:tcPr>
           <w:p>
             <w:pPr>
@@ -2939,13 +3073,13 @@
               <w:rPr>
                 <w:sz w:val="20"/>
               </w:rPr>
-              <w:t>quiet</w:t>
+              <w:t>bench</w:t>
             </w:r>
           </w:p>
         </w:tc>
         <w:tc>
           <w:tcPr>
-            <w:tcW w:type="dxa" w:w="960"/>
+            <w:tcW w:type="dxa" w:w="785"/>
           </w:tcPr>
           <w:p>
             <w:pPr>
@@ -2956,7 +3090,58 @@
               <w:rPr>
                 <w:sz w:val="20"/>
               </w:rPr>
-              <w:t>town</w:t>
+              <w:t>near</w:t>
+            </w:r>
+          </w:p>
+        </w:tc>
+        <w:tc>
+          <w:tcPr>
+            <w:tcW w:type="dxa" w:w="785"/>
+          </w:tcPr>
+          <w:p>
+            <w:pPr>
+              <w:jc w:val="center"/>
+            </w:pPr>
+            <w:r/>
+            <w:r>
+              <w:rPr>
+                <w:sz w:val="20"/>
+              </w:rPr>
+              <w:t>the</w:t>
+            </w:r>
+          </w:p>
+        </w:tc>
+        <w:tc>
+          <w:tcPr>
+            <w:tcW w:type="dxa" w:w="785"/>
+          </w:tcPr>
+          <w:p>
+            <w:pPr>
+              <w:jc w:val="center"/>
+            </w:pPr>
+            <w:r/>
+            <w:r>
+              <w:rPr>
+                <w:sz w:val="20"/>
+              </w:rPr>
+              <w:t>old</w:t>
+            </w:r>
+          </w:p>
+        </w:tc>
+        <w:tc>
+          <w:tcPr>
+            <w:tcW w:type="dxa" w:w="785"/>
+          </w:tcPr>
+          <w:p>
+            <w:pPr>
+              <w:jc w:val="center"/>
+            </w:pPr>
+            <w:r/>
+            <w:r>
+              <w:rPr>
+                <w:sz w:val="20"/>
+              </w:rPr>
+              <w:t>fountain</w:t>
             </w:r>
           </w:p>
         </w:tc>
@@ -2964,7 +3149,7 @@
       <w:tr>
         <w:tc>
           <w:tcPr>
-            <w:tcW w:type="dxa" w:w="960"/>
+            <w:tcW w:type="dxa" w:w="785"/>
             <w:shd w:fill="E8E8E8" w:val="clear"/>
           </w:tcPr>
           <w:p>
@@ -2983,7 +3168,7 @@
         </w:tc>
         <w:tc>
           <w:tcPr>
-            <w:tcW w:type="dxa" w:w="960"/>
+            <w:tcW w:type="dxa" w:w="785"/>
           </w:tcPr>
           <w:p>
             <w:pPr>
@@ -2994,7 +3179,7 @@
         </w:tc>
         <w:tc>
           <w:tcPr>
-            <w:tcW w:type="dxa" w:w="960"/>
+            <w:tcW w:type="dxa" w:w="785"/>
           </w:tcPr>
           <w:p>
             <w:pPr>
@@ -3005,7 +3190,7 @@
         </w:tc>
         <w:tc>
           <w:tcPr>
-            <w:tcW w:type="dxa" w:w="960"/>
+            <w:tcW w:type="dxa" w:w="785"/>
           </w:tcPr>
           <w:p>
             <w:pPr>
@@ -3016,7 +3201,7 @@
         </w:tc>
         <w:tc>
           <w:tcPr>
-            <w:tcW w:type="dxa" w:w="960"/>
+            <w:tcW w:type="dxa" w:w="785"/>
           </w:tcPr>
           <w:p>
             <w:pPr>
@@ -3027,7 +3212,7 @@
         </w:tc>
         <w:tc>
           <w:tcPr>
-            <w:tcW w:type="dxa" w:w="960"/>
+            <w:tcW w:type="dxa" w:w="785"/>
           </w:tcPr>
           <w:p>
             <w:pPr>
@@ -3038,7 +3223,7 @@
         </w:tc>
         <w:tc>
           <w:tcPr>
-            <w:tcW w:type="dxa" w:w="960"/>
+            <w:tcW w:type="dxa" w:w="785"/>
           </w:tcPr>
           <w:p>
             <w:pPr>
@@ -3049,7 +3234,7 @@
         </w:tc>
         <w:tc>
           <w:tcPr>
-            <w:tcW w:type="dxa" w:w="960"/>
+            <w:tcW w:type="dxa" w:w="785"/>
           </w:tcPr>
           <w:p>
             <w:pPr>
@@ -3060,7 +3245,29 @@
         </w:tc>
         <w:tc>
           <w:tcPr>
-            <w:tcW w:type="dxa" w:w="960"/>
+            <w:tcW w:type="dxa" w:w="785"/>
+          </w:tcPr>
+          <w:p>
+            <w:pPr>
+              <w:jc w:val="center"/>
+            </w:pPr>
+            <w:r/>
+          </w:p>
+        </w:tc>
+        <w:tc>
+          <w:tcPr>
+            <w:tcW w:type="dxa" w:w="785"/>
+          </w:tcPr>
+          <w:p>
+            <w:pPr>
+              <w:jc w:val="center"/>
+            </w:pPr>
+            <w:r/>
+          </w:p>
+        </w:tc>
+        <w:tc>
+          <w:tcPr>
+            <w:tcW w:type="dxa" w:w="785"/>
           </w:tcPr>
           <w:p>
             <w:pPr>
@@ -3155,7 +3362,7 @@
           <w:i/>
           <w:sz w:val="22"/>
         </w:rPr>
-        <w:t>They walked very slowly along the narrow path.</w:t>
+        <w:t>She sat quite peacefully near the tall fountain in the old courtyard.</w:t>
       </w:r>
     </w:p>
     <w:tbl>
@@ -3166,20 +3373,24 @@
         <w:tblLook w:firstColumn="1" w:firstRow="1" w:lastColumn="0" w:lastRow="0" w:noHBand="0" w:noVBand="1" w:val="04A0"/>
       </w:tblPr>
       <w:tblGrid>
-        <w:gridCol w:w="960"/>
-        <w:gridCol w:w="960"/>
-        <w:gridCol w:w="960"/>
-        <w:gridCol w:w="960"/>
-        <w:gridCol w:w="960"/>
-        <w:gridCol w:w="960"/>
-        <w:gridCol w:w="960"/>
-        <w:gridCol w:w="960"/>
-        <w:gridCol w:w="960"/>
+        <w:gridCol w:w="665"/>
+        <w:gridCol w:w="665"/>
+        <w:gridCol w:w="665"/>
+        <w:gridCol w:w="665"/>
+        <w:gridCol w:w="665"/>
+        <w:gridCol w:w="665"/>
+        <w:gridCol w:w="665"/>
+        <w:gridCol w:w="665"/>
+        <w:gridCol w:w="665"/>
+        <w:gridCol w:w="665"/>
+        <w:gridCol w:w="665"/>
+        <w:gridCol w:w="665"/>
+        <w:gridCol w:w="665"/>
       </w:tblGrid>
       <w:tr>
         <w:tc>
           <w:tcPr>
-            <w:tcW w:type="dxa" w:w="960"/>
+            <w:tcW w:type="dxa" w:w="665"/>
             <w:shd w:fill="E8E8E8" w:val="clear"/>
           </w:tcPr>
           <w:p>
@@ -3198,7 +3409,7 @@
         </w:tc>
         <w:tc>
           <w:tcPr>
-            <w:tcW w:type="dxa" w:w="960"/>
+            <w:tcW w:type="dxa" w:w="665"/>
           </w:tcPr>
           <w:p>
             <w:pPr>
@@ -3215,8 +3426,8 @@
         </w:tc>
         <w:tc>
           <w:tcPr>
-            <w:tcW w:type="dxa" w:w="6720"/>
-            <w:gridSpan w:val="7"/>
+            <w:tcW w:type="dxa" w:w="7315"/>
+            <w:gridSpan w:val="11"/>
           </w:tcPr>
           <w:p>
             <w:pPr>
@@ -3235,7 +3446,7 @@
       <w:tr>
         <w:tc>
           <w:tcPr>
-            <w:tcW w:type="dxa" w:w="960"/>
+            <w:tcW w:type="dxa" w:w="665"/>
             <w:shd w:fill="E8E8E8" w:val="clear"/>
           </w:tcPr>
           <w:p>
@@ -3254,7 +3465,7 @@
         </w:tc>
         <w:tc>
           <w:tcPr>
-            <w:tcW w:type="dxa" w:w="960"/>
+            <w:tcW w:type="dxa" w:w="665"/>
           </w:tcPr>
           <w:p>
             <w:pPr>
@@ -3271,7 +3482,7 @@
         </w:tc>
         <w:tc>
           <w:tcPr>
-            <w:tcW w:type="dxa" w:w="960"/>
+            <w:tcW w:type="dxa" w:w="665"/>
           </w:tcPr>
           <w:p>
             <w:pPr>
@@ -3288,7 +3499,7 @@
         </w:tc>
         <w:tc>
           <w:tcPr>
-            <w:tcW w:type="dxa" w:w="1920"/>
+            <w:tcW w:type="dxa" w:w="1330"/>
             <w:gridSpan w:val="2"/>
           </w:tcPr>
           <w:p>
@@ -3306,7 +3517,7 @@
         </w:tc>
         <w:tc>
           <w:tcPr>
-            <w:tcW w:type="dxa" w:w="3840"/>
+            <w:tcW w:type="dxa" w:w="2660"/>
             <w:gridSpan w:val="4"/>
           </w:tcPr>
           <w:p>
@@ -3322,11 +3533,29 @@
             </w:r>
           </w:p>
         </w:tc>
+        <w:tc>
+          <w:tcPr>
+            <w:tcW w:type="dxa" w:w="2660"/>
+            <w:gridSpan w:val="4"/>
+          </w:tcPr>
+          <w:p>
+            <w:pPr>
+              <w:jc w:val="center"/>
+            </w:pPr>
+            <w:r/>
+            <w:r>
+              <w:rPr>
+                <w:sz w:val="20"/>
+              </w:rPr>
+              <w:t xml:space="preserve"> </w:t>
+            </w:r>
+          </w:p>
+        </w:tc>
       </w:tr>
       <w:tr>
         <w:tc>
           <w:tcPr>
-            <w:tcW w:type="dxa" w:w="960"/>
+            <w:tcW w:type="dxa" w:w="665"/>
             <w:shd w:fill="E8E8E8" w:val="clear"/>
           </w:tcPr>
           <w:p>
@@ -3345,7 +3574,7 @@
         </w:tc>
         <w:tc>
           <w:tcPr>
-            <w:tcW w:type="dxa" w:w="960"/>
+            <w:tcW w:type="dxa" w:w="665"/>
           </w:tcPr>
           <w:p>
             <w:pPr>
@@ -3356,13 +3585,13 @@
               <w:rPr>
                 <w:sz w:val="20"/>
               </w:rPr>
-              <w:t>They</w:t>
+              <w:t>She</w:t>
             </w:r>
           </w:p>
         </w:tc>
         <w:tc>
           <w:tcPr>
-            <w:tcW w:type="dxa" w:w="960"/>
+            <w:tcW w:type="dxa" w:w="665"/>
           </w:tcPr>
           <w:p>
             <w:pPr>
@@ -3373,13 +3602,13 @@
               <w:rPr>
                 <w:sz w:val="20"/>
               </w:rPr>
-              <w:t>walked</w:t>
+              <w:t>sat</w:t>
             </w:r>
           </w:p>
         </w:tc>
         <w:tc>
           <w:tcPr>
-            <w:tcW w:type="dxa" w:w="960"/>
+            <w:tcW w:type="dxa" w:w="665"/>
           </w:tcPr>
           <w:p>
             <w:pPr>
@@ -3390,13 +3619,13 @@
               <w:rPr>
                 <w:sz w:val="20"/>
               </w:rPr>
-              <w:t>very</w:t>
+              <w:t>quite</w:t>
             </w:r>
           </w:p>
         </w:tc>
         <w:tc>
           <w:tcPr>
-            <w:tcW w:type="dxa" w:w="960"/>
+            <w:tcW w:type="dxa" w:w="665"/>
           </w:tcPr>
           <w:p>
             <w:pPr>
@@ -3407,13 +3636,13 @@
               <w:rPr>
                 <w:sz w:val="20"/>
               </w:rPr>
-              <w:t>slowly</w:t>
+              <w:t>peacefully</w:t>
             </w:r>
           </w:p>
         </w:tc>
         <w:tc>
           <w:tcPr>
-            <w:tcW w:type="dxa" w:w="960"/>
+            <w:tcW w:type="dxa" w:w="665"/>
           </w:tcPr>
           <w:p>
             <w:pPr>
@@ -3424,13 +3653,13 @@
               <w:rPr>
                 <w:sz w:val="20"/>
               </w:rPr>
-              <w:t>along</w:t>
+              <w:t>near</w:t>
             </w:r>
           </w:p>
         </w:tc>
         <w:tc>
           <w:tcPr>
-            <w:tcW w:type="dxa" w:w="960"/>
+            <w:tcW w:type="dxa" w:w="665"/>
           </w:tcPr>
           <w:p>
             <w:pPr>
@@ -3447,7 +3676,7 @@
         </w:tc>
         <w:tc>
           <w:tcPr>
-            <w:tcW w:type="dxa" w:w="960"/>
+            <w:tcW w:type="dxa" w:w="665"/>
           </w:tcPr>
           <w:p>
             <w:pPr>
@@ -3458,13 +3687,13 @@
               <w:rPr>
                 <w:sz w:val="20"/>
               </w:rPr>
-              <w:t>narrow</w:t>
+              <w:t>tall</w:t>
             </w:r>
           </w:p>
         </w:tc>
         <w:tc>
           <w:tcPr>
-            <w:tcW w:type="dxa" w:w="960"/>
+            <w:tcW w:type="dxa" w:w="665"/>
           </w:tcPr>
           <w:p>
             <w:pPr>
@@ -3475,7 +3704,75 @@
               <w:rPr>
                 <w:sz w:val="20"/>
               </w:rPr>
-              <w:t>path</w:t>
+              <w:t>fountain</w:t>
+            </w:r>
+          </w:p>
+        </w:tc>
+        <w:tc>
+          <w:tcPr>
+            <w:tcW w:type="dxa" w:w="665"/>
+          </w:tcPr>
+          <w:p>
+            <w:pPr>
+              <w:jc w:val="center"/>
+            </w:pPr>
+            <w:r/>
+            <w:r>
+              <w:rPr>
+                <w:sz w:val="20"/>
+              </w:rPr>
+              <w:t>in</w:t>
+            </w:r>
+          </w:p>
+        </w:tc>
+        <w:tc>
+          <w:tcPr>
+            <w:tcW w:type="dxa" w:w="665"/>
+          </w:tcPr>
+          <w:p>
+            <w:pPr>
+              <w:jc w:val="center"/>
+            </w:pPr>
+            <w:r/>
+            <w:r>
+              <w:rPr>
+                <w:sz w:val="20"/>
+              </w:rPr>
+              <w:t>the</w:t>
+            </w:r>
+          </w:p>
+        </w:tc>
+        <w:tc>
+          <w:tcPr>
+            <w:tcW w:type="dxa" w:w="665"/>
+          </w:tcPr>
+          <w:p>
+            <w:pPr>
+              <w:jc w:val="center"/>
+            </w:pPr>
+            <w:r/>
+            <w:r>
+              <w:rPr>
+                <w:sz w:val="20"/>
+              </w:rPr>
+              <w:t>old</w:t>
+            </w:r>
+          </w:p>
+        </w:tc>
+        <w:tc>
+          <w:tcPr>
+            <w:tcW w:type="dxa" w:w="665"/>
+          </w:tcPr>
+          <w:p>
+            <w:pPr>
+              <w:jc w:val="center"/>
+            </w:pPr>
+            <w:r/>
+            <w:r>
+              <w:rPr>
+                <w:sz w:val="20"/>
+              </w:rPr>
+              <w:t>courtyard</w:t>
             </w:r>
           </w:p>
         </w:tc>
@@ -3483,7 +3780,7 @@
       <w:tr>
         <w:tc>
           <w:tcPr>
-            <w:tcW w:type="dxa" w:w="960"/>
+            <w:tcW w:type="dxa" w:w="665"/>
             <w:shd w:fill="E8E8E8" w:val="clear"/>
           </w:tcPr>
           <w:p>
@@ -3502,7 +3799,7 @@
         </w:tc>
         <w:tc>
           <w:tcPr>
-            <w:tcW w:type="dxa" w:w="960"/>
+            <w:tcW w:type="dxa" w:w="665"/>
           </w:tcPr>
           <w:p>
             <w:pPr>
@@ -3513,7 +3810,7 @@
         </w:tc>
         <w:tc>
           <w:tcPr>
-            <w:tcW w:type="dxa" w:w="960"/>
+            <w:tcW w:type="dxa" w:w="665"/>
           </w:tcPr>
           <w:p>
             <w:pPr>
@@ -3524,7 +3821,7 @@
         </w:tc>
         <w:tc>
           <w:tcPr>
-            <w:tcW w:type="dxa" w:w="960"/>
+            <w:tcW w:type="dxa" w:w="665"/>
           </w:tcPr>
           <w:p>
             <w:pPr>
@@ -3535,7 +3832,7 @@
         </w:tc>
         <w:tc>
           <w:tcPr>
-            <w:tcW w:type="dxa" w:w="960"/>
+            <w:tcW w:type="dxa" w:w="665"/>
           </w:tcPr>
           <w:p>
             <w:pPr>
@@ -3546,7 +3843,7 @@
         </w:tc>
         <w:tc>
           <w:tcPr>
-            <w:tcW w:type="dxa" w:w="960"/>
+            <w:tcW w:type="dxa" w:w="665"/>
           </w:tcPr>
           <w:p>
             <w:pPr>
@@ -3557,7 +3854,7 @@
         </w:tc>
         <w:tc>
           <w:tcPr>
-            <w:tcW w:type="dxa" w:w="960"/>
+            <w:tcW w:type="dxa" w:w="665"/>
           </w:tcPr>
           <w:p>
             <w:pPr>
@@ -3568,7 +3865,7 @@
         </w:tc>
         <w:tc>
           <w:tcPr>
-            <w:tcW w:type="dxa" w:w="960"/>
+            <w:tcW w:type="dxa" w:w="665"/>
           </w:tcPr>
           <w:p>
             <w:pPr>
@@ -3579,7 +3876,51 @@
         </w:tc>
         <w:tc>
           <w:tcPr>
-            <w:tcW w:type="dxa" w:w="960"/>
+            <w:tcW w:type="dxa" w:w="665"/>
+          </w:tcPr>
+          <w:p>
+            <w:pPr>
+              <w:jc w:val="center"/>
+            </w:pPr>
+            <w:r/>
+          </w:p>
+        </w:tc>
+        <w:tc>
+          <w:tcPr>
+            <w:tcW w:type="dxa" w:w="665"/>
+          </w:tcPr>
+          <w:p>
+            <w:pPr>
+              <w:jc w:val="center"/>
+            </w:pPr>
+            <w:r/>
+          </w:p>
+        </w:tc>
+        <w:tc>
+          <w:tcPr>
+            <w:tcW w:type="dxa" w:w="665"/>
+          </w:tcPr>
+          <w:p>
+            <w:pPr>
+              <w:jc w:val="center"/>
+            </w:pPr>
+            <w:r/>
+          </w:p>
+        </w:tc>
+        <w:tc>
+          <w:tcPr>
+            <w:tcW w:type="dxa" w:w="665"/>
+          </w:tcPr>
+          <w:p>
+            <w:pPr>
+              <w:jc w:val="center"/>
+            </w:pPr>
+            <w:r/>
+          </w:p>
+        </w:tc>
+        <w:tc>
+          <w:tcPr>
+            <w:tcW w:type="dxa" w:w="665"/>
           </w:tcPr>
           <w:p>
             <w:pPr>
@@ -3674,7 +4015,7 @@
           <w:i/>
           <w:sz w:val="22"/>
         </w:rPr>
-        <w:t>The nervous professor spoke clearly at the podium.</w:t>
+        <w:t>The tired old dog from the farm slept quietly near the fire.</w:t>
       </w:r>
     </w:p>
     <w:tbl>
@@ -3685,20 +4026,24 @@
         <w:tblLook w:firstColumn="1" w:firstRow="1" w:lastColumn="0" w:lastRow="0" w:noHBand="0" w:noVBand="1" w:val="04A0"/>
       </w:tblPr>
       <w:tblGrid>
-        <w:gridCol w:w="960"/>
-        <w:gridCol w:w="960"/>
-        <w:gridCol w:w="960"/>
-        <w:gridCol w:w="960"/>
-        <w:gridCol w:w="960"/>
-        <w:gridCol w:w="960"/>
-        <w:gridCol w:w="960"/>
-        <w:gridCol w:w="960"/>
-        <w:gridCol w:w="960"/>
+        <w:gridCol w:w="665"/>
+        <w:gridCol w:w="665"/>
+        <w:gridCol w:w="665"/>
+        <w:gridCol w:w="665"/>
+        <w:gridCol w:w="665"/>
+        <w:gridCol w:w="665"/>
+        <w:gridCol w:w="665"/>
+        <w:gridCol w:w="665"/>
+        <w:gridCol w:w="665"/>
+        <w:gridCol w:w="665"/>
+        <w:gridCol w:w="665"/>
+        <w:gridCol w:w="665"/>
+        <w:gridCol w:w="665"/>
       </w:tblGrid>
       <w:tr>
         <w:tc>
           <w:tcPr>
-            <w:tcW w:type="dxa" w:w="960"/>
+            <w:tcW w:type="dxa" w:w="665"/>
             <w:shd w:fill="E8E8E8" w:val="clear"/>
           </w:tcPr>
           <w:p>
@@ -3717,8 +4062,8 @@
         </w:tc>
         <w:tc>
           <w:tcPr>
-            <w:tcW w:type="dxa" w:w="2880"/>
-            <w:gridSpan w:val="3"/>
+            <w:tcW w:type="dxa" w:w="4655"/>
+            <w:gridSpan w:val="7"/>
           </w:tcPr>
           <w:p>
             <w:pPr>
@@ -3735,7 +4080,7 @@
         </w:tc>
         <w:tc>
           <w:tcPr>
-            <w:tcW w:type="dxa" w:w="4800"/>
+            <w:tcW w:type="dxa" w:w="3325"/>
             <w:gridSpan w:val="5"/>
           </w:tcPr>
           <w:p>
@@ -3755,7 +4100,7 @@
       <w:tr>
         <w:tc>
           <w:tcPr>
-            <w:tcW w:type="dxa" w:w="960"/>
+            <w:tcW w:type="dxa" w:w="665"/>
             <w:shd w:fill="E8E8E8" w:val="clear"/>
           </w:tcPr>
           <w:p>
@@ -3774,8 +4119,8 @@
         </w:tc>
         <w:tc>
           <w:tcPr>
-            <w:tcW w:type="dxa" w:w="2880"/>
-            <w:gridSpan w:val="3"/>
+            <w:tcW w:type="dxa" w:w="2660"/>
+            <w:gridSpan w:val="4"/>
           </w:tcPr>
           <w:p>
             <w:pPr>
@@ -3792,7 +4137,8 @@
         </w:tc>
         <w:tc>
           <w:tcPr>
-            <w:tcW w:type="dxa" w:w="960"/>
+            <w:tcW w:type="dxa" w:w="1995"/>
+            <w:gridSpan w:val="3"/>
           </w:tcPr>
           <w:p>
             <w:pPr>
@@ -3809,7 +4155,7 @@
         </w:tc>
         <w:tc>
           <w:tcPr>
-            <w:tcW w:type="dxa" w:w="960"/>
+            <w:tcW w:type="dxa" w:w="665"/>
           </w:tcPr>
           <w:p>
             <w:pPr>
@@ -3826,8 +4172,7 @@
         </w:tc>
         <w:tc>
           <w:tcPr>
-            <w:tcW w:type="dxa" w:w="2880"/>
-            <w:gridSpan w:val="3"/>
+            <w:tcW w:type="dxa" w:w="665"/>
           </w:tcPr>
           <w:p>
             <w:pPr>
@@ -3842,11 +4187,29 @@
             </w:r>
           </w:p>
         </w:tc>
+        <w:tc>
+          <w:tcPr>
+            <w:tcW w:type="dxa" w:w="1995"/>
+            <w:gridSpan w:val="3"/>
+          </w:tcPr>
+          <w:p>
+            <w:pPr>
+              <w:jc w:val="center"/>
+            </w:pPr>
+            <w:r/>
+            <w:r>
+              <w:rPr>
+                <w:sz w:val="20"/>
+              </w:rPr>
+              <w:t xml:space="preserve"> </w:t>
+            </w:r>
+          </w:p>
+        </w:tc>
       </w:tr>
       <w:tr>
         <w:tc>
           <w:tcPr>
-            <w:tcW w:type="dxa" w:w="960"/>
+            <w:tcW w:type="dxa" w:w="665"/>
             <w:shd w:fill="E8E8E8" w:val="clear"/>
           </w:tcPr>
           <w:p>
@@ -3865,7 +4228,7 @@
         </w:tc>
         <w:tc>
           <w:tcPr>
-            <w:tcW w:type="dxa" w:w="960"/>
+            <w:tcW w:type="dxa" w:w="665"/>
           </w:tcPr>
           <w:p>
             <w:pPr>
@@ -3882,7 +4245,7 @@
         </w:tc>
         <w:tc>
           <w:tcPr>
-            <w:tcW w:type="dxa" w:w="960"/>
+            <w:tcW w:type="dxa" w:w="665"/>
           </w:tcPr>
           <w:p>
             <w:pPr>
@@ -3893,13 +4256,13 @@
               <w:rPr>
                 <w:sz w:val="20"/>
               </w:rPr>
-              <w:t>nervous</w:t>
+              <w:t>tired</w:t>
             </w:r>
           </w:p>
         </w:tc>
         <w:tc>
           <w:tcPr>
-            <w:tcW w:type="dxa" w:w="960"/>
+            <w:tcW w:type="dxa" w:w="665"/>
           </w:tcPr>
           <w:p>
             <w:pPr>
@@ -3910,13 +4273,13 @@
               <w:rPr>
                 <w:sz w:val="20"/>
               </w:rPr>
-              <w:t>professor</w:t>
+              <w:t>old</w:t>
             </w:r>
           </w:p>
         </w:tc>
         <w:tc>
           <w:tcPr>
-            <w:tcW w:type="dxa" w:w="960"/>
+            <w:tcW w:type="dxa" w:w="665"/>
           </w:tcPr>
           <w:p>
             <w:pPr>
@@ -3927,13 +4290,13 @@
               <w:rPr>
                 <w:sz w:val="20"/>
               </w:rPr>
-              <w:t>spoke</w:t>
+              <w:t>dog</w:t>
             </w:r>
           </w:p>
         </w:tc>
         <w:tc>
           <w:tcPr>
-            <w:tcW w:type="dxa" w:w="960"/>
+            <w:tcW w:type="dxa" w:w="665"/>
           </w:tcPr>
           <w:p>
             <w:pPr>
@@ -3944,30 +4307,13 @@
               <w:rPr>
                 <w:sz w:val="20"/>
               </w:rPr>
-              <w:t>clearly</w:t>
+              <w:t>from</w:t>
             </w:r>
           </w:p>
         </w:tc>
         <w:tc>
           <w:tcPr>
-            <w:tcW w:type="dxa" w:w="960"/>
-          </w:tcPr>
-          <w:p>
-            <w:pPr>
-              <w:jc w:val="center"/>
-            </w:pPr>
-            <w:r/>
-            <w:r>
-              <w:rPr>
-                <w:sz w:val="20"/>
-              </w:rPr>
-              <w:t>at</w:t>
-            </w:r>
-          </w:p>
-        </w:tc>
-        <w:tc>
-          <w:tcPr>
-            <w:tcW w:type="dxa" w:w="960"/>
+            <w:tcW w:type="dxa" w:w="665"/>
           </w:tcPr>
           <w:p>
             <w:pPr>
@@ -3984,7 +4330,7 @@
         </w:tc>
         <w:tc>
           <w:tcPr>
-            <w:tcW w:type="dxa" w:w="960"/>
+            <w:tcW w:type="dxa" w:w="665"/>
           </w:tcPr>
           <w:p>
             <w:pPr>
@@ -3995,7 +4341,92 @@
               <w:rPr>
                 <w:sz w:val="20"/>
               </w:rPr>
-              <w:t>podium</w:t>
+              <w:t>farm</w:t>
+            </w:r>
+          </w:p>
+        </w:tc>
+        <w:tc>
+          <w:tcPr>
+            <w:tcW w:type="dxa" w:w="665"/>
+          </w:tcPr>
+          <w:p>
+            <w:pPr>
+              <w:jc w:val="center"/>
+            </w:pPr>
+            <w:r/>
+            <w:r>
+              <w:rPr>
+                <w:sz w:val="20"/>
+              </w:rPr>
+              <w:t>slept</w:t>
+            </w:r>
+          </w:p>
+        </w:tc>
+        <w:tc>
+          <w:tcPr>
+            <w:tcW w:type="dxa" w:w="665"/>
+          </w:tcPr>
+          <w:p>
+            <w:pPr>
+              <w:jc w:val="center"/>
+            </w:pPr>
+            <w:r/>
+            <w:r>
+              <w:rPr>
+                <w:sz w:val="20"/>
+              </w:rPr>
+              <w:t>quietly</w:t>
+            </w:r>
+          </w:p>
+        </w:tc>
+        <w:tc>
+          <w:tcPr>
+            <w:tcW w:type="dxa" w:w="665"/>
+          </w:tcPr>
+          <w:p>
+            <w:pPr>
+              <w:jc w:val="center"/>
+            </w:pPr>
+            <w:r/>
+            <w:r>
+              <w:rPr>
+                <w:sz w:val="20"/>
+              </w:rPr>
+              <w:t>near</w:t>
+            </w:r>
+          </w:p>
+        </w:tc>
+        <w:tc>
+          <w:tcPr>
+            <w:tcW w:type="dxa" w:w="665"/>
+          </w:tcPr>
+          <w:p>
+            <w:pPr>
+              <w:jc w:val="center"/>
+            </w:pPr>
+            <w:r/>
+            <w:r>
+              <w:rPr>
+                <w:sz w:val="20"/>
+              </w:rPr>
+              <w:t>the</w:t>
+            </w:r>
+          </w:p>
+        </w:tc>
+        <w:tc>
+          <w:tcPr>
+            <w:tcW w:type="dxa" w:w="665"/>
+          </w:tcPr>
+          <w:p>
+            <w:pPr>
+              <w:jc w:val="center"/>
+            </w:pPr>
+            <w:r/>
+            <w:r>
+              <w:rPr>
+                <w:sz w:val="20"/>
+              </w:rPr>
+              <w:t>fire</w:t>
             </w:r>
           </w:p>
         </w:tc>
@@ -4003,7 +4434,7 @@
       <w:tr>
         <w:tc>
           <w:tcPr>
-            <w:tcW w:type="dxa" w:w="960"/>
+            <w:tcW w:type="dxa" w:w="665"/>
             <w:shd w:fill="E8E8E8" w:val="clear"/>
           </w:tcPr>
           <w:p>
@@ -4022,7 +4453,7 @@
         </w:tc>
         <w:tc>
           <w:tcPr>
-            <w:tcW w:type="dxa" w:w="960"/>
+            <w:tcW w:type="dxa" w:w="665"/>
           </w:tcPr>
           <w:p>
             <w:pPr>
@@ -4033,7 +4464,7 @@
         </w:tc>
         <w:tc>
           <w:tcPr>
-            <w:tcW w:type="dxa" w:w="960"/>
+            <w:tcW w:type="dxa" w:w="665"/>
           </w:tcPr>
           <w:p>
             <w:pPr>
@@ -4044,7 +4475,7 @@
         </w:tc>
         <w:tc>
           <w:tcPr>
-            <w:tcW w:type="dxa" w:w="960"/>
+            <w:tcW w:type="dxa" w:w="665"/>
           </w:tcPr>
           <w:p>
             <w:pPr>
@@ -4055,7 +4486,7 @@
         </w:tc>
         <w:tc>
           <w:tcPr>
-            <w:tcW w:type="dxa" w:w="960"/>
+            <w:tcW w:type="dxa" w:w="665"/>
           </w:tcPr>
           <w:p>
             <w:pPr>
@@ -4066,7 +4497,7 @@
         </w:tc>
         <w:tc>
           <w:tcPr>
-            <w:tcW w:type="dxa" w:w="960"/>
+            <w:tcW w:type="dxa" w:w="665"/>
           </w:tcPr>
           <w:p>
             <w:pPr>
@@ -4077,7 +4508,7 @@
         </w:tc>
         <w:tc>
           <w:tcPr>
-            <w:tcW w:type="dxa" w:w="960"/>
+            <w:tcW w:type="dxa" w:w="665"/>
           </w:tcPr>
           <w:p>
             <w:pPr>
@@ -4088,7 +4519,7 @@
         </w:tc>
         <w:tc>
           <w:tcPr>
-            <w:tcW w:type="dxa" w:w="960"/>
+            <w:tcW w:type="dxa" w:w="665"/>
           </w:tcPr>
           <w:p>
             <w:pPr>
@@ -4099,7 +4530,51 @@
         </w:tc>
         <w:tc>
           <w:tcPr>
-            <w:tcW w:type="dxa" w:w="960"/>
+            <w:tcW w:type="dxa" w:w="665"/>
+          </w:tcPr>
+          <w:p>
+            <w:pPr>
+              <w:jc w:val="center"/>
+            </w:pPr>
+            <w:r/>
+          </w:p>
+        </w:tc>
+        <w:tc>
+          <w:tcPr>
+            <w:tcW w:type="dxa" w:w="665"/>
+          </w:tcPr>
+          <w:p>
+            <w:pPr>
+              <w:jc w:val="center"/>
+            </w:pPr>
+            <w:r/>
+          </w:p>
+        </w:tc>
+        <w:tc>
+          <w:tcPr>
+            <w:tcW w:type="dxa" w:w="665"/>
+          </w:tcPr>
+          <w:p>
+            <w:pPr>
+              <w:jc w:val="center"/>
+            </w:pPr>
+            <w:r/>
+          </w:p>
+        </w:tc>
+        <w:tc>
+          <w:tcPr>
+            <w:tcW w:type="dxa" w:w="665"/>
+          </w:tcPr>
+          <w:p>
+            <w:pPr>
+              <w:jc w:val="center"/>
+            </w:pPr>
+            <w:r/>
+          </w:p>
+        </w:tc>
+        <w:tc>
+          <w:tcPr>
+            <w:tcW w:type="dxa" w:w="665"/>
           </w:tcPr>
           <w:p>
             <w:pPr>
@@ -4194,7 +4669,7 @@
           <w:i/>
           <w:sz w:val="22"/>
         </w:rPr>
-        <w:t>Small birds sang loudly near the old oak.</w:t>
+        <w:t>The nervous boy sat rigidly in the hard narrow chair.</w:t>
       </w:r>
     </w:p>
     <w:tbl>
@@ -4205,20 +4680,22 @@
         <w:tblLook w:firstColumn="1" w:firstRow="1" w:lastColumn="0" w:lastRow="0" w:noHBand="0" w:noVBand="1" w:val="04A0"/>
       </w:tblPr>
       <w:tblGrid>
-        <w:gridCol w:w="960"/>
-        <w:gridCol w:w="960"/>
-        <w:gridCol w:w="960"/>
-        <w:gridCol w:w="960"/>
-        <w:gridCol w:w="960"/>
-        <w:gridCol w:w="960"/>
-        <w:gridCol w:w="960"/>
-        <w:gridCol w:w="960"/>
-        <w:gridCol w:w="960"/>
+        <w:gridCol w:w="785"/>
+        <w:gridCol w:w="785"/>
+        <w:gridCol w:w="785"/>
+        <w:gridCol w:w="785"/>
+        <w:gridCol w:w="785"/>
+        <w:gridCol w:w="785"/>
+        <w:gridCol w:w="785"/>
+        <w:gridCol w:w="785"/>
+        <w:gridCol w:w="785"/>
+        <w:gridCol w:w="785"/>
+        <w:gridCol w:w="785"/>
       </w:tblGrid>
       <w:tr>
         <w:tc>
           <w:tcPr>
-            <w:tcW w:type="dxa" w:w="960"/>
+            <w:tcW w:type="dxa" w:w="785"/>
             <w:shd w:fill="E8E8E8" w:val="clear"/>
           </w:tcPr>
           <w:p>
@@ -4237,8 +4714,8 @@
         </w:tc>
         <w:tc>
           <w:tcPr>
-            <w:tcW w:type="dxa" w:w="1920"/>
-            <w:gridSpan w:val="2"/>
+            <w:tcW w:type="dxa" w:w="2355"/>
+            <w:gridSpan w:val="3"/>
           </w:tcPr>
           <w:p>
             <w:pPr>
@@ -4255,8 +4732,8 @@
         </w:tc>
         <w:tc>
           <w:tcPr>
-            <w:tcW w:type="dxa" w:w="5760"/>
-            <w:gridSpan w:val="6"/>
+            <w:tcW w:type="dxa" w:w="5495"/>
+            <w:gridSpan w:val="7"/>
           </w:tcPr>
           <w:p>
             <w:pPr>
@@ -4275,7 +4752,7 @@
       <w:tr>
         <w:tc>
           <w:tcPr>
-            <w:tcW w:type="dxa" w:w="960"/>
+            <w:tcW w:type="dxa" w:w="785"/>
             <w:shd w:fill="E8E8E8" w:val="clear"/>
           </w:tcPr>
           <w:p>
@@ -4294,8 +4771,8 @@
         </w:tc>
         <w:tc>
           <w:tcPr>
-            <w:tcW w:type="dxa" w:w="1920"/>
-            <w:gridSpan w:val="2"/>
+            <w:tcW w:type="dxa" w:w="2355"/>
+            <w:gridSpan w:val="3"/>
           </w:tcPr>
           <w:p>
             <w:pPr>
@@ -4312,7 +4789,7 @@
         </w:tc>
         <w:tc>
           <w:tcPr>
-            <w:tcW w:type="dxa" w:w="960"/>
+            <w:tcW w:type="dxa" w:w="785"/>
           </w:tcPr>
           <w:p>
             <w:pPr>
@@ -4329,7 +4806,7 @@
         </w:tc>
         <w:tc>
           <w:tcPr>
-            <w:tcW w:type="dxa" w:w="960"/>
+            <w:tcW w:type="dxa" w:w="785"/>
           </w:tcPr>
           <w:p>
             <w:pPr>
@@ -4346,8 +4823,8 @@
         </w:tc>
         <w:tc>
           <w:tcPr>
-            <w:tcW w:type="dxa" w:w="3840"/>
-            <w:gridSpan w:val="4"/>
+            <w:tcW w:type="dxa" w:w="3925"/>
+            <w:gridSpan w:val="5"/>
           </w:tcPr>
           <w:p>
             <w:pPr>
@@ -4366,7 +4843,7 @@
       <w:tr>
         <w:tc>
           <w:tcPr>
-            <w:tcW w:type="dxa" w:w="960"/>
+            <w:tcW w:type="dxa" w:w="785"/>
             <w:shd w:fill="E8E8E8" w:val="clear"/>
           </w:tcPr>
           <w:p>
@@ -4385,7 +4862,7 @@
         </w:tc>
         <w:tc>
           <w:tcPr>
-            <w:tcW w:type="dxa" w:w="960"/>
+            <w:tcW w:type="dxa" w:w="785"/>
           </w:tcPr>
           <w:p>
             <w:pPr>
@@ -4396,13 +4873,13 @@
               <w:rPr>
                 <w:sz w:val="20"/>
               </w:rPr>
-              <w:t>Small</w:t>
+              <w:t>The</w:t>
             </w:r>
           </w:p>
         </w:tc>
         <w:tc>
           <w:tcPr>
-            <w:tcW w:type="dxa" w:w="960"/>
+            <w:tcW w:type="dxa" w:w="785"/>
           </w:tcPr>
           <w:p>
             <w:pPr>
@@ -4413,13 +4890,13 @@
               <w:rPr>
                 <w:sz w:val="20"/>
               </w:rPr>
-              <w:t>birds</w:t>
+              <w:t>nervous</w:t>
             </w:r>
           </w:p>
         </w:tc>
         <w:tc>
           <w:tcPr>
-            <w:tcW w:type="dxa" w:w="960"/>
+            <w:tcW w:type="dxa" w:w="785"/>
           </w:tcPr>
           <w:p>
             <w:pPr>
@@ -4430,13 +4907,13 @@
               <w:rPr>
                 <w:sz w:val="20"/>
               </w:rPr>
-              <w:t>sang</w:t>
+              <w:t>boy</w:t>
             </w:r>
           </w:p>
         </w:tc>
         <w:tc>
           <w:tcPr>
-            <w:tcW w:type="dxa" w:w="960"/>
+            <w:tcW w:type="dxa" w:w="785"/>
           </w:tcPr>
           <w:p>
             <w:pPr>
@@ -4447,13 +4924,13 @@
               <w:rPr>
                 <w:sz w:val="20"/>
               </w:rPr>
-              <w:t>loudly</w:t>
+              <w:t>sat</w:t>
             </w:r>
           </w:p>
         </w:tc>
         <w:tc>
           <w:tcPr>
-            <w:tcW w:type="dxa" w:w="960"/>
+            <w:tcW w:type="dxa" w:w="785"/>
           </w:tcPr>
           <w:p>
             <w:pPr>
@@ -4464,13 +4941,30 @@
               <w:rPr>
                 <w:sz w:val="20"/>
               </w:rPr>
-              <w:t>near</w:t>
+              <w:t>rigidly</w:t>
             </w:r>
           </w:p>
         </w:tc>
         <w:tc>
           <w:tcPr>
-            <w:tcW w:type="dxa" w:w="960"/>
+            <w:tcW w:type="dxa" w:w="785"/>
+          </w:tcPr>
+          <w:p>
+            <w:pPr>
+              <w:jc w:val="center"/>
+            </w:pPr>
+            <w:r/>
+            <w:r>
+              <w:rPr>
+                <w:sz w:val="20"/>
+              </w:rPr>
+              <w:t>in</w:t>
+            </w:r>
+          </w:p>
+        </w:tc>
+        <w:tc>
+          <w:tcPr>
+            <w:tcW w:type="dxa" w:w="785"/>
           </w:tcPr>
           <w:p>
             <w:pPr>
@@ -4487,7 +4981,7 @@
         </w:tc>
         <w:tc>
           <w:tcPr>
-            <w:tcW w:type="dxa" w:w="960"/>
+            <w:tcW w:type="dxa" w:w="785"/>
           </w:tcPr>
           <w:p>
             <w:pPr>
@@ -4498,13 +4992,13 @@
               <w:rPr>
                 <w:sz w:val="20"/>
               </w:rPr>
-              <w:t>old</w:t>
+              <w:t>hard</w:t>
             </w:r>
           </w:p>
         </w:tc>
         <w:tc>
           <w:tcPr>
-            <w:tcW w:type="dxa" w:w="960"/>
+            <w:tcW w:type="dxa" w:w="785"/>
           </w:tcPr>
           <w:p>
             <w:pPr>
@@ -4515,7 +5009,24 @@
               <w:rPr>
                 <w:sz w:val="20"/>
               </w:rPr>
-              <w:t>oak</w:t>
+              <w:t>narrow</w:t>
+            </w:r>
+          </w:p>
+        </w:tc>
+        <w:tc>
+          <w:tcPr>
+            <w:tcW w:type="dxa" w:w="785"/>
+          </w:tcPr>
+          <w:p>
+            <w:pPr>
+              <w:jc w:val="center"/>
+            </w:pPr>
+            <w:r/>
+            <w:r>
+              <w:rPr>
+                <w:sz w:val="20"/>
+              </w:rPr>
+              <w:t>chair</w:t>
             </w:r>
           </w:p>
         </w:tc>
@@ -4523,7 +5034,7 @@
       <w:tr>
         <w:tc>
           <w:tcPr>
-            <w:tcW w:type="dxa" w:w="960"/>
+            <w:tcW w:type="dxa" w:w="785"/>
             <w:shd w:fill="E8E8E8" w:val="clear"/>
           </w:tcPr>
           <w:p>
@@ -4542,7 +5053,7 @@
         </w:tc>
         <w:tc>
           <w:tcPr>
-            <w:tcW w:type="dxa" w:w="960"/>
+            <w:tcW w:type="dxa" w:w="785"/>
           </w:tcPr>
           <w:p>
             <w:pPr>
@@ -4553,7 +5064,7 @@
         </w:tc>
         <w:tc>
           <w:tcPr>
-            <w:tcW w:type="dxa" w:w="960"/>
+            <w:tcW w:type="dxa" w:w="785"/>
           </w:tcPr>
           <w:p>
             <w:pPr>
@@ -4564,7 +5075,7 @@
         </w:tc>
         <w:tc>
           <w:tcPr>
-            <w:tcW w:type="dxa" w:w="960"/>
+            <w:tcW w:type="dxa" w:w="785"/>
           </w:tcPr>
           <w:p>
             <w:pPr>
@@ -4575,7 +5086,7 @@
         </w:tc>
         <w:tc>
           <w:tcPr>
-            <w:tcW w:type="dxa" w:w="960"/>
+            <w:tcW w:type="dxa" w:w="785"/>
           </w:tcPr>
           <w:p>
             <w:pPr>
@@ -4586,7 +5097,7 @@
         </w:tc>
         <w:tc>
           <w:tcPr>
-            <w:tcW w:type="dxa" w:w="960"/>
+            <w:tcW w:type="dxa" w:w="785"/>
           </w:tcPr>
           <w:p>
             <w:pPr>
@@ -4597,7 +5108,7 @@
         </w:tc>
         <w:tc>
           <w:tcPr>
-            <w:tcW w:type="dxa" w:w="960"/>
+            <w:tcW w:type="dxa" w:w="785"/>
           </w:tcPr>
           <w:p>
             <w:pPr>
@@ -4608,7 +5119,7 @@
         </w:tc>
         <w:tc>
           <w:tcPr>
-            <w:tcW w:type="dxa" w:w="960"/>
+            <w:tcW w:type="dxa" w:w="785"/>
           </w:tcPr>
           <w:p>
             <w:pPr>
@@ -4619,7 +5130,29 @@
         </w:tc>
         <w:tc>
           <w:tcPr>
-            <w:tcW w:type="dxa" w:w="960"/>
+            <w:tcW w:type="dxa" w:w="785"/>
+          </w:tcPr>
+          <w:p>
+            <w:pPr>
+              <w:jc w:val="center"/>
+            </w:pPr>
+            <w:r/>
+          </w:p>
+        </w:tc>
+        <w:tc>
+          <w:tcPr>
+            <w:tcW w:type="dxa" w:w="785"/>
+          </w:tcPr>
+          <w:p>
+            <w:pPr>
+              <w:jc w:val="center"/>
+            </w:pPr>
+            <w:r/>
+          </w:p>
+        </w:tc>
+        <w:tc>
+          <w:tcPr>
+            <w:tcW w:type="dxa" w:w="785"/>
           </w:tcPr>
           <w:p>
             <w:pPr>
@@ -4714,7 +5247,7 @@
           <w:i/>
           <w:sz w:val="22"/>
         </w:rPr>
-        <w:t>He waited very patiently outside the large building.</w:t>
+        <w:t>The small birds sang very loudly deep in the dark forest.</w:t>
       </w:r>
     </w:p>
     <w:tbl>
@@ -4725,20 +5258,23 @@
         <w:tblLook w:firstColumn="1" w:firstRow="1" w:lastColumn="0" w:lastRow="0" w:noHBand="0" w:noVBand="1" w:val="04A0"/>
       </w:tblPr>
       <w:tblGrid>
-        <w:gridCol w:w="960"/>
-        <w:gridCol w:w="960"/>
-        <w:gridCol w:w="960"/>
-        <w:gridCol w:w="960"/>
-        <w:gridCol w:w="960"/>
-        <w:gridCol w:w="960"/>
-        <w:gridCol w:w="960"/>
-        <w:gridCol w:w="960"/>
-        <w:gridCol w:w="960"/>
+        <w:gridCol w:w="720"/>
+        <w:gridCol w:w="720"/>
+        <w:gridCol w:w="720"/>
+        <w:gridCol w:w="720"/>
+        <w:gridCol w:w="720"/>
+        <w:gridCol w:w="720"/>
+        <w:gridCol w:w="720"/>
+        <w:gridCol w:w="720"/>
+        <w:gridCol w:w="720"/>
+        <w:gridCol w:w="720"/>
+        <w:gridCol w:w="720"/>
+        <w:gridCol w:w="720"/>
       </w:tblGrid>
       <w:tr>
         <w:tc>
           <w:tcPr>
-            <w:tcW w:type="dxa" w:w="960"/>
+            <w:tcW w:type="dxa" w:w="720"/>
             <w:shd w:fill="E8E8E8" w:val="clear"/>
           </w:tcPr>
           <w:p>
@@ -4757,7 +5293,8 @@
         </w:tc>
         <w:tc>
           <w:tcPr>
-            <w:tcW w:type="dxa" w:w="960"/>
+            <w:tcW w:type="dxa" w:w="2160"/>
+            <w:gridSpan w:val="3"/>
           </w:tcPr>
           <w:p>
             <w:pPr>
@@ -4774,8 +5311,8 @@
         </w:tc>
         <w:tc>
           <w:tcPr>
-            <w:tcW w:type="dxa" w:w="6720"/>
-            <w:gridSpan w:val="7"/>
+            <w:tcW w:type="dxa" w:w="5760"/>
+            <w:gridSpan w:val="8"/>
           </w:tcPr>
           <w:p>
             <w:pPr>
@@ -4794,7 +5331,7 @@
       <w:tr>
         <w:tc>
           <w:tcPr>
-            <w:tcW w:type="dxa" w:w="960"/>
+            <w:tcW w:type="dxa" w:w="720"/>
             <w:shd w:fill="E8E8E8" w:val="clear"/>
           </w:tcPr>
           <w:p>
@@ -4813,7 +5350,8 @@
         </w:tc>
         <w:tc>
           <w:tcPr>
-            <w:tcW w:type="dxa" w:w="960"/>
+            <w:tcW w:type="dxa" w:w="2160"/>
+            <w:gridSpan w:val="3"/>
           </w:tcPr>
           <w:p>
             <w:pPr>
@@ -4830,7 +5368,7 @@
         </w:tc>
         <w:tc>
           <w:tcPr>
-            <w:tcW w:type="dxa" w:w="960"/>
+            <w:tcW w:type="dxa" w:w="720"/>
           </w:tcPr>
           <w:p>
             <w:pPr>
@@ -4847,7 +5385,7 @@
         </w:tc>
         <w:tc>
           <w:tcPr>
-            <w:tcW w:type="dxa" w:w="1920"/>
+            <w:tcW w:type="dxa" w:w="1440"/>
             <w:gridSpan w:val="2"/>
           </w:tcPr>
           <w:p>
@@ -4865,8 +5403,8 @@
         </w:tc>
         <w:tc>
           <w:tcPr>
-            <w:tcW w:type="dxa" w:w="3840"/>
-            <w:gridSpan w:val="4"/>
+            <w:tcW w:type="dxa" w:w="3600"/>
+            <w:gridSpan w:val="5"/>
           </w:tcPr>
           <w:p>
             <w:pPr>
@@ -4885,7 +5423,7 @@
       <w:tr>
         <w:tc>
           <w:tcPr>
-            <w:tcW w:type="dxa" w:w="960"/>
+            <w:tcW w:type="dxa" w:w="720"/>
             <w:shd w:fill="E8E8E8" w:val="clear"/>
           </w:tcPr>
           <w:p>
@@ -4904,7 +5442,7 @@
         </w:tc>
         <w:tc>
           <w:tcPr>
-            <w:tcW w:type="dxa" w:w="960"/>
+            <w:tcW w:type="dxa" w:w="720"/>
           </w:tcPr>
           <w:p>
             <w:pPr>
@@ -4915,13 +5453,13 @@
               <w:rPr>
                 <w:sz w:val="20"/>
               </w:rPr>
-              <w:t>He</w:t>
+              <w:t>The</w:t>
             </w:r>
           </w:p>
         </w:tc>
         <w:tc>
           <w:tcPr>
-            <w:tcW w:type="dxa" w:w="960"/>
+            <w:tcW w:type="dxa" w:w="720"/>
           </w:tcPr>
           <w:p>
             <w:pPr>
@@ -4932,13 +5470,47 @@
               <w:rPr>
                 <w:sz w:val="20"/>
               </w:rPr>
-              <w:t>waited</w:t>
+              <w:t>small</w:t>
             </w:r>
           </w:p>
         </w:tc>
         <w:tc>
           <w:tcPr>
-            <w:tcW w:type="dxa" w:w="960"/>
+            <w:tcW w:type="dxa" w:w="720"/>
+          </w:tcPr>
+          <w:p>
+            <w:pPr>
+              <w:jc w:val="center"/>
+            </w:pPr>
+            <w:r/>
+            <w:r>
+              <w:rPr>
+                <w:sz w:val="20"/>
+              </w:rPr>
+              <w:t>birds</w:t>
+            </w:r>
+          </w:p>
+        </w:tc>
+        <w:tc>
+          <w:tcPr>
+            <w:tcW w:type="dxa" w:w="720"/>
+          </w:tcPr>
+          <w:p>
+            <w:pPr>
+              <w:jc w:val="center"/>
+            </w:pPr>
+            <w:r/>
+            <w:r>
+              <w:rPr>
+                <w:sz w:val="20"/>
+              </w:rPr>
+              <w:t>sang</w:t>
+            </w:r>
+          </w:p>
+        </w:tc>
+        <w:tc>
+          <w:tcPr>
+            <w:tcW w:type="dxa" w:w="720"/>
           </w:tcPr>
           <w:p>
             <w:pPr>
@@ -4955,7 +5527,7 @@
         </w:tc>
         <w:tc>
           <w:tcPr>
-            <w:tcW w:type="dxa" w:w="960"/>
+            <w:tcW w:type="dxa" w:w="720"/>
           </w:tcPr>
           <w:p>
             <w:pPr>
@@ -4966,13 +5538,13 @@
               <w:rPr>
                 <w:sz w:val="20"/>
               </w:rPr>
-              <w:t>patiently</w:t>
+              <w:t>loudly</w:t>
             </w:r>
           </w:p>
         </w:tc>
         <w:tc>
           <w:tcPr>
-            <w:tcW w:type="dxa" w:w="960"/>
+            <w:tcW w:type="dxa" w:w="720"/>
           </w:tcPr>
           <w:p>
             <w:pPr>
@@ -4983,13 +5555,30 @@
               <w:rPr>
                 <w:sz w:val="20"/>
               </w:rPr>
-              <w:t>outside</w:t>
+              <w:t>deep</w:t>
             </w:r>
           </w:p>
         </w:tc>
         <w:tc>
           <w:tcPr>
-            <w:tcW w:type="dxa" w:w="960"/>
+            <w:tcW w:type="dxa" w:w="720"/>
+          </w:tcPr>
+          <w:p>
+            <w:pPr>
+              <w:jc w:val="center"/>
+            </w:pPr>
+            <w:r/>
+            <w:r>
+              <w:rPr>
+                <w:sz w:val="20"/>
+              </w:rPr>
+              <w:t>in</w:t>
+            </w:r>
+          </w:p>
+        </w:tc>
+        <w:tc>
+          <w:tcPr>
+            <w:tcW w:type="dxa" w:w="720"/>
           </w:tcPr>
           <w:p>
             <w:pPr>
@@ -5006,7 +5595,7 @@
         </w:tc>
         <w:tc>
           <w:tcPr>
-            <w:tcW w:type="dxa" w:w="960"/>
+            <w:tcW w:type="dxa" w:w="720"/>
           </w:tcPr>
           <w:p>
             <w:pPr>
@@ -5017,13 +5606,13 @@
               <w:rPr>
                 <w:sz w:val="20"/>
               </w:rPr>
-              <w:t>large</w:t>
+              <w:t>dark</w:t>
             </w:r>
           </w:p>
         </w:tc>
         <w:tc>
           <w:tcPr>
-            <w:tcW w:type="dxa" w:w="960"/>
+            <w:tcW w:type="dxa" w:w="720"/>
           </w:tcPr>
           <w:p>
             <w:pPr>
@@ -5034,7 +5623,7 @@
               <w:rPr>
                 <w:sz w:val="20"/>
               </w:rPr>
-              <w:t>building</w:t>
+              <w:t>forest</w:t>
             </w:r>
           </w:p>
         </w:tc>
@@ -5042,7 +5631,7 @@
       <w:tr>
         <w:tc>
           <w:tcPr>
-            <w:tcW w:type="dxa" w:w="960"/>
+            <w:tcW w:type="dxa" w:w="720"/>
             <w:shd w:fill="E8E8E8" w:val="clear"/>
           </w:tcPr>
           <w:p>
@@ -5061,7 +5650,7 @@
         </w:tc>
         <w:tc>
           <w:tcPr>
-            <w:tcW w:type="dxa" w:w="960"/>
+            <w:tcW w:type="dxa" w:w="720"/>
           </w:tcPr>
           <w:p>
             <w:pPr>
@@ -5072,7 +5661,7 @@
         </w:tc>
         <w:tc>
           <w:tcPr>
-            <w:tcW w:type="dxa" w:w="960"/>
+            <w:tcW w:type="dxa" w:w="720"/>
           </w:tcPr>
           <w:p>
             <w:pPr>
@@ -5083,7 +5672,7 @@
         </w:tc>
         <w:tc>
           <w:tcPr>
-            <w:tcW w:type="dxa" w:w="960"/>
+            <w:tcW w:type="dxa" w:w="720"/>
           </w:tcPr>
           <w:p>
             <w:pPr>
@@ -5094,7 +5683,7 @@
         </w:tc>
         <w:tc>
           <w:tcPr>
-            <w:tcW w:type="dxa" w:w="960"/>
+            <w:tcW w:type="dxa" w:w="720"/>
           </w:tcPr>
           <w:p>
             <w:pPr>
@@ -5105,7 +5694,7 @@
         </w:tc>
         <w:tc>
           <w:tcPr>
-            <w:tcW w:type="dxa" w:w="960"/>
+            <w:tcW w:type="dxa" w:w="720"/>
           </w:tcPr>
           <w:p>
             <w:pPr>
@@ -5116,7 +5705,7 @@
         </w:tc>
         <w:tc>
           <w:tcPr>
-            <w:tcW w:type="dxa" w:w="960"/>
+            <w:tcW w:type="dxa" w:w="720"/>
           </w:tcPr>
           <w:p>
             <w:pPr>
@@ -5127,7 +5716,7 @@
         </w:tc>
         <w:tc>
           <w:tcPr>
-            <w:tcW w:type="dxa" w:w="960"/>
+            <w:tcW w:type="dxa" w:w="720"/>
           </w:tcPr>
           <w:p>
             <w:pPr>
@@ -5138,7 +5727,40 @@
         </w:tc>
         <w:tc>
           <w:tcPr>
-            <w:tcW w:type="dxa" w:w="960"/>
+            <w:tcW w:type="dxa" w:w="720"/>
+          </w:tcPr>
+          <w:p>
+            <w:pPr>
+              <w:jc w:val="center"/>
+            </w:pPr>
+            <w:r/>
+          </w:p>
+        </w:tc>
+        <w:tc>
+          <w:tcPr>
+            <w:tcW w:type="dxa" w:w="720"/>
+          </w:tcPr>
+          <w:p>
+            <w:pPr>
+              <w:jc w:val="center"/>
+            </w:pPr>
+            <w:r/>
+          </w:p>
+        </w:tc>
+        <w:tc>
+          <w:tcPr>
+            <w:tcW w:type="dxa" w:w="720"/>
+          </w:tcPr>
+          <w:p>
+            <w:pPr>
+              <w:jc w:val="center"/>
+            </w:pPr>
+            <w:r/>
+          </w:p>
+        </w:tc>
+        <w:tc>
+          <w:tcPr>
+            <w:tcW w:type="dxa" w:w="720"/>
           </w:tcPr>
           <w:p>
             <w:pPr>
@@ -5233,7 +5855,7 @@
           <w:i/>
           <w:sz w:val="22"/>
         </w:rPr>
-        <w:t>The tired runner collapsed suddenly at the barrier.</w:t>
+        <w:t>The old woman confident in her skills spoke quite passionately.</w:t>
       </w:r>
     </w:p>
     <w:tbl>
@@ -5244,20 +5866,22 @@
         <w:tblLook w:firstColumn="1" w:firstRow="1" w:lastColumn="0" w:lastRow="0" w:noHBand="0" w:noVBand="1" w:val="04A0"/>
       </w:tblPr>
       <w:tblGrid>
-        <w:gridCol w:w="960"/>
-        <w:gridCol w:w="960"/>
-        <w:gridCol w:w="960"/>
-        <w:gridCol w:w="960"/>
-        <w:gridCol w:w="960"/>
-        <w:gridCol w:w="960"/>
-        <w:gridCol w:w="960"/>
-        <w:gridCol w:w="960"/>
-        <w:gridCol w:w="960"/>
+        <w:gridCol w:w="785"/>
+        <w:gridCol w:w="785"/>
+        <w:gridCol w:w="785"/>
+        <w:gridCol w:w="785"/>
+        <w:gridCol w:w="785"/>
+        <w:gridCol w:w="785"/>
+        <w:gridCol w:w="785"/>
+        <w:gridCol w:w="785"/>
+        <w:gridCol w:w="785"/>
+        <w:gridCol w:w="785"/>
+        <w:gridCol w:w="785"/>
       </w:tblGrid>
       <w:tr>
         <w:tc>
           <w:tcPr>
-            <w:tcW w:type="dxa" w:w="960"/>
+            <w:tcW w:type="dxa" w:w="785"/>
             <w:shd w:fill="E8E8E8" w:val="clear"/>
           </w:tcPr>
           <w:p>
@@ -5276,8 +5900,8 @@
         </w:tc>
         <w:tc>
           <w:tcPr>
-            <w:tcW w:type="dxa" w:w="2880"/>
-            <w:gridSpan w:val="3"/>
+            <w:tcW w:type="dxa" w:w="5495"/>
+            <w:gridSpan w:val="7"/>
           </w:tcPr>
           <w:p>
             <w:pPr>
@@ -5294,8 +5918,8 @@
         </w:tc>
         <w:tc>
           <w:tcPr>
-            <w:tcW w:type="dxa" w:w="4800"/>
-            <w:gridSpan w:val="5"/>
+            <w:tcW w:type="dxa" w:w="2355"/>
+            <w:gridSpan w:val="3"/>
           </w:tcPr>
           <w:p>
             <w:pPr>
@@ -5314,7 +5938,7 @@
       <w:tr>
         <w:tc>
           <w:tcPr>
-            <w:tcW w:type="dxa" w:w="960"/>
+            <w:tcW w:type="dxa" w:w="785"/>
             <w:shd w:fill="E8E8E8" w:val="clear"/>
           </w:tcPr>
           <w:p>
@@ -5333,7 +5957,7 @@
         </w:tc>
         <w:tc>
           <w:tcPr>
-            <w:tcW w:type="dxa" w:w="2880"/>
+            <w:tcW w:type="dxa" w:w="2355"/>
             <w:gridSpan w:val="3"/>
           </w:tcPr>
           <w:p>
@@ -5351,7 +5975,8 @@
         </w:tc>
         <w:tc>
           <w:tcPr>
-            <w:tcW w:type="dxa" w:w="960"/>
+            <w:tcW w:type="dxa" w:w="3140"/>
+            <w:gridSpan w:val="4"/>
           </w:tcPr>
           <w:p>
             <w:pPr>
@@ -5368,7 +5993,7 @@
         </w:tc>
         <w:tc>
           <w:tcPr>
-            <w:tcW w:type="dxa" w:w="960"/>
+            <w:tcW w:type="dxa" w:w="785"/>
           </w:tcPr>
           <w:p>
             <w:pPr>
@@ -5385,8 +6010,8 @@
         </w:tc>
         <w:tc>
           <w:tcPr>
-            <w:tcW w:type="dxa" w:w="2880"/>
-            <w:gridSpan w:val="3"/>
+            <w:tcW w:type="dxa" w:w="1570"/>
+            <w:gridSpan w:val="2"/>
           </w:tcPr>
           <w:p>
             <w:pPr>
@@ -5405,7 +6030,7 @@
       <w:tr>
         <w:tc>
           <w:tcPr>
-            <w:tcW w:type="dxa" w:w="960"/>
+            <w:tcW w:type="dxa" w:w="785"/>
             <w:shd w:fill="E8E8E8" w:val="clear"/>
           </w:tcPr>
           <w:p>
@@ -5424,7 +6049,7 @@
         </w:tc>
         <w:tc>
           <w:tcPr>
-            <w:tcW w:type="dxa" w:w="960"/>
+            <w:tcW w:type="dxa" w:w="785"/>
           </w:tcPr>
           <w:p>
             <w:pPr>
@@ -5441,7 +6066,7 @@
         </w:tc>
         <w:tc>
           <w:tcPr>
-            <w:tcW w:type="dxa" w:w="960"/>
+            <w:tcW w:type="dxa" w:w="785"/>
           </w:tcPr>
           <w:p>
             <w:pPr>
@@ -5452,13 +6077,13 @@
               <w:rPr>
                 <w:sz w:val="20"/>
               </w:rPr>
-              <w:t>tired</w:t>
+              <w:t>old</w:t>
             </w:r>
           </w:p>
         </w:tc>
         <w:tc>
           <w:tcPr>
-            <w:tcW w:type="dxa" w:w="960"/>
+            <w:tcW w:type="dxa" w:w="785"/>
           </w:tcPr>
           <w:p>
             <w:pPr>
@@ -5469,13 +6094,13 @@
               <w:rPr>
                 <w:sz w:val="20"/>
               </w:rPr>
-              <w:t>runner</w:t>
+              <w:t>woman</w:t>
             </w:r>
           </w:p>
         </w:tc>
         <w:tc>
           <w:tcPr>
-            <w:tcW w:type="dxa" w:w="960"/>
+            <w:tcW w:type="dxa" w:w="785"/>
           </w:tcPr>
           <w:p>
             <w:pPr>
@@ -5486,13 +6111,13 @@
               <w:rPr>
                 <w:sz w:val="20"/>
               </w:rPr>
-              <w:t>collapsed</w:t>
+              <w:t>confident</w:t>
             </w:r>
           </w:p>
         </w:tc>
         <w:tc>
           <w:tcPr>
-            <w:tcW w:type="dxa" w:w="960"/>
+            <w:tcW w:type="dxa" w:w="785"/>
           </w:tcPr>
           <w:p>
             <w:pPr>
@@ -5503,13 +6128,13 @@
               <w:rPr>
                 <w:sz w:val="20"/>
               </w:rPr>
-              <w:t>suddenly</w:t>
+              <w:t>in</w:t>
             </w:r>
           </w:p>
         </w:tc>
         <w:tc>
           <w:tcPr>
-            <w:tcW w:type="dxa" w:w="960"/>
+            <w:tcW w:type="dxa" w:w="785"/>
           </w:tcPr>
           <w:p>
             <w:pPr>
@@ -5520,13 +6145,13 @@
               <w:rPr>
                 <w:sz w:val="20"/>
               </w:rPr>
-              <w:t>at</w:t>
+              <w:t>her</w:t>
             </w:r>
           </w:p>
         </w:tc>
         <w:tc>
           <w:tcPr>
-            <w:tcW w:type="dxa" w:w="960"/>
+            <w:tcW w:type="dxa" w:w="785"/>
           </w:tcPr>
           <w:p>
             <w:pPr>
@@ -5537,13 +6162,13 @@
               <w:rPr>
                 <w:sz w:val="20"/>
               </w:rPr>
-              <w:t>the</w:t>
+              <w:t>skills</w:t>
             </w:r>
           </w:p>
         </w:tc>
         <w:tc>
           <w:tcPr>
-            <w:tcW w:type="dxa" w:w="960"/>
+            <w:tcW w:type="dxa" w:w="785"/>
           </w:tcPr>
           <w:p>
             <w:pPr>
@@ -5554,7 +6179,41 @@
               <w:rPr>
                 <w:sz w:val="20"/>
               </w:rPr>
-              <w:t>barrier</w:t>
+              <w:t>spoke</w:t>
+            </w:r>
+          </w:p>
+        </w:tc>
+        <w:tc>
+          <w:tcPr>
+            <w:tcW w:type="dxa" w:w="785"/>
+          </w:tcPr>
+          <w:p>
+            <w:pPr>
+              <w:jc w:val="center"/>
+            </w:pPr>
+            <w:r/>
+            <w:r>
+              <w:rPr>
+                <w:sz w:val="20"/>
+              </w:rPr>
+              <w:t>quite</w:t>
+            </w:r>
+          </w:p>
+        </w:tc>
+        <w:tc>
+          <w:tcPr>
+            <w:tcW w:type="dxa" w:w="785"/>
+          </w:tcPr>
+          <w:p>
+            <w:pPr>
+              <w:jc w:val="center"/>
+            </w:pPr>
+            <w:r/>
+            <w:r>
+              <w:rPr>
+                <w:sz w:val="20"/>
+              </w:rPr>
+              <w:t>passionately</w:t>
             </w:r>
           </w:p>
         </w:tc>
@@ -5562,7 +6221,7 @@
       <w:tr>
         <w:tc>
           <w:tcPr>
-            <w:tcW w:type="dxa" w:w="960"/>
+            <w:tcW w:type="dxa" w:w="785"/>
             <w:shd w:fill="E8E8E8" w:val="clear"/>
           </w:tcPr>
           <w:p>
@@ -5581,7 +6240,7 @@
         </w:tc>
         <w:tc>
           <w:tcPr>
-            <w:tcW w:type="dxa" w:w="960"/>
+            <w:tcW w:type="dxa" w:w="785"/>
           </w:tcPr>
           <w:p>
             <w:pPr>
@@ -5592,7 +6251,7 @@
         </w:tc>
         <w:tc>
           <w:tcPr>
-            <w:tcW w:type="dxa" w:w="960"/>
+            <w:tcW w:type="dxa" w:w="785"/>
           </w:tcPr>
           <w:p>
             <w:pPr>
@@ -5603,7 +6262,7 @@
         </w:tc>
         <w:tc>
           <w:tcPr>
-            <w:tcW w:type="dxa" w:w="960"/>
+            <w:tcW w:type="dxa" w:w="785"/>
           </w:tcPr>
           <w:p>
             <w:pPr>
@@ -5614,7 +6273,7 @@
         </w:tc>
         <w:tc>
           <w:tcPr>
-            <w:tcW w:type="dxa" w:w="960"/>
+            <w:tcW w:type="dxa" w:w="785"/>
           </w:tcPr>
           <w:p>
             <w:pPr>
@@ -5625,7 +6284,7 @@
         </w:tc>
         <w:tc>
           <w:tcPr>
-            <w:tcW w:type="dxa" w:w="960"/>
+            <w:tcW w:type="dxa" w:w="785"/>
           </w:tcPr>
           <w:p>
             <w:pPr>
@@ -5636,7 +6295,7 @@
         </w:tc>
         <w:tc>
           <w:tcPr>
-            <w:tcW w:type="dxa" w:w="960"/>
+            <w:tcW w:type="dxa" w:w="785"/>
           </w:tcPr>
           <w:p>
             <w:pPr>
@@ -5647,7 +6306,7 @@
         </w:tc>
         <w:tc>
           <w:tcPr>
-            <w:tcW w:type="dxa" w:w="960"/>
+            <w:tcW w:type="dxa" w:w="785"/>
           </w:tcPr>
           <w:p>
             <w:pPr>
@@ -5658,7 +6317,29 @@
         </w:tc>
         <w:tc>
           <w:tcPr>
-            <w:tcW w:type="dxa" w:w="960"/>
+            <w:tcW w:type="dxa" w:w="785"/>
+          </w:tcPr>
+          <w:p>
+            <w:pPr>
+              <w:jc w:val="center"/>
+            </w:pPr>
+            <w:r/>
+          </w:p>
+        </w:tc>
+        <w:tc>
+          <w:tcPr>
+            <w:tcW w:type="dxa" w:w="785"/>
+          </w:tcPr>
+          <w:p>
+            <w:pPr>
+              <w:jc w:val="center"/>
+            </w:pPr>
+            <w:r/>
+          </w:p>
+        </w:tc>
+        <w:tc>
+          <w:tcPr>
+            <w:tcW w:type="dxa" w:w="785"/>
           </w:tcPr>
           <w:p>
             <w:pPr>

</xml_diff>

<commit_message>
Fix Bonus 1: remove SyntaxTreeHybrid req, drop bracket line, wrap intensifier ADVs in ADVP
- Instructions: remove SyntaxTreeHybrid mention; say 'paste your diagram below'
- Student version: remove blank line after 'Bracket notation:'
- Bracket notation: [ADVP [ADV very] [ADV x]] → [ADVP [ADVP [ADV very]] [ADV x]]
  for Q3/Q4/Q6/Q9/Q10; regenerated affected PNGs

Co-Authored-By: Claude Sonnet 4.6 <noreply@anthropic.com>
</commit_message>
<xml_diff>
--- a/Homework/Exams/ENGL 3110 - S26 - Bonus Assignment.docx
+++ b/Homework/Exams/ENGL 3110 - S26 - Bonus Assignment.docx
@@ -104,7 +104,7 @@
         <w:rPr>
           <w:sz w:val="22"/>
         </w:rPr>
-        <w:t>using SyntaxTreeHybrid. In the student version, paste or attach your diagram in the space provided. In the answer key, the completed diagram is shown.</w:t>
+        <w:t>and paste your diagram below.</w:t>
       </w:r>
     </w:p>
     <w:p>
@@ -1066,12 +1066,6 @@
         </w:rPr>
         <w:t xml:space="preserve">Bracket notation: </w:t>
       </w:r>
-      <w:r>
-        <w:rPr>
-          <w:sz w:val="20"/>
-        </w:rPr>
-        <w:t>______________________________________________________________________</w:t>
-      </w:r>
     </w:p>
     <w:p>
       <w:pPr>
@@ -1089,7 +1083,7 @@
           <w:i/>
           <w:sz w:val="20"/>
         </w:rPr>
-        <w:t>Use SyntaxTreeHybrid to create your tree diagram. Paste or attach your PNG image below.</w:t>
+        <w:t>Please paste your diagram below.</w:t>
       </w:r>
     </w:p>
     <w:p>
@@ -1644,12 +1638,6 @@
         </w:rPr>
         <w:t xml:space="preserve">Bracket notation: </w:t>
       </w:r>
-      <w:r>
-        <w:rPr>
-          <w:sz w:val="20"/>
-        </w:rPr>
-        <w:t>______________________________________________________________________</w:t>
-      </w:r>
     </w:p>
     <w:p>
       <w:pPr>
@@ -1667,7 +1655,7 @@
           <w:i/>
           <w:sz w:val="20"/>
         </w:rPr>
-        <w:t>Use SyntaxTreeHybrid to create your tree diagram. Paste or attach your PNG image below.</w:t>
+        <w:t>Please paste your diagram below.</w:t>
       </w:r>
     </w:p>
     <w:p>
@@ -2165,12 +2153,6 @@
         </w:rPr>
         <w:t xml:space="preserve">Bracket notation: </w:t>
       </w:r>
-      <w:r>
-        <w:rPr>
-          <w:sz w:val="20"/>
-        </w:rPr>
-        <w:t>______________________________________________________________________</w:t>
-      </w:r>
     </w:p>
     <w:p>
       <w:pPr>
@@ -2188,7 +2170,7 @@
           <w:i/>
           <w:sz w:val="20"/>
         </w:rPr>
-        <w:t>Use SyntaxTreeHybrid to create your tree diagram. Paste or attach your PNG image below.</w:t>
+        <w:t>Please paste your diagram below.</w:t>
       </w:r>
     </w:p>
     <w:p>
@@ -2695,12 +2677,6 @@
         </w:rPr>
         <w:t xml:space="preserve">Bracket notation: </w:t>
       </w:r>
-      <w:r>
-        <w:rPr>
-          <w:sz w:val="20"/>
-        </w:rPr>
-        <w:t>______________________________________________________________________</w:t>
-      </w:r>
     </w:p>
     <w:p>
       <w:pPr>
@@ -2718,7 +2694,7 @@
           <w:i/>
           <w:sz w:val="20"/>
         </w:rPr>
-        <w:t>Use SyntaxTreeHybrid to create your tree diagram. Paste or attach your PNG image below.</w:t>
+        <w:t>Please paste your diagram below.</w:t>
       </w:r>
     </w:p>
     <w:p>
@@ -3289,12 +3265,6 @@
         </w:rPr>
         <w:t xml:space="preserve">Bracket notation: </w:t>
       </w:r>
-      <w:r>
-        <w:rPr>
-          <w:sz w:val="20"/>
-        </w:rPr>
-        <w:t>______________________________________________________________________</w:t>
-      </w:r>
     </w:p>
     <w:p>
       <w:pPr>
@@ -3312,7 +3282,7 @@
           <w:i/>
           <w:sz w:val="20"/>
         </w:rPr>
-        <w:t>Use SyntaxTreeHybrid to create your tree diagram. Paste or attach your PNG image below.</w:t>
+        <w:t>Please paste your diagram below.</w:t>
       </w:r>
     </w:p>
     <w:p>
@@ -3942,12 +3912,6 @@
         </w:rPr>
         <w:t xml:space="preserve">Bracket notation: </w:t>
       </w:r>
-      <w:r>
-        <w:rPr>
-          <w:sz w:val="20"/>
-        </w:rPr>
-        <w:t>______________________________________________________________________</w:t>
-      </w:r>
     </w:p>
     <w:p>
       <w:pPr>
@@ -3965,7 +3929,7 @@
           <w:i/>
           <w:sz w:val="20"/>
         </w:rPr>
-        <w:t>Use SyntaxTreeHybrid to create your tree diagram. Paste or attach your PNG image below.</w:t>
+        <w:t>Please paste your diagram below.</w:t>
       </w:r>
     </w:p>
     <w:p>
@@ -4596,12 +4560,6 @@
         </w:rPr>
         <w:t xml:space="preserve">Bracket notation: </w:t>
       </w:r>
-      <w:r>
-        <w:rPr>
-          <w:sz w:val="20"/>
-        </w:rPr>
-        <w:t>______________________________________________________________________</w:t>
-      </w:r>
     </w:p>
     <w:p>
       <w:pPr>
@@ -4619,7 +4577,7 @@
           <w:i/>
           <w:sz w:val="20"/>
         </w:rPr>
-        <w:t>Use SyntaxTreeHybrid to create your tree diagram. Paste or attach your PNG image below.</w:t>
+        <w:t>Please paste your diagram below.</w:t>
       </w:r>
     </w:p>
     <w:p>
@@ -5174,12 +5132,6 @@
         </w:rPr>
         <w:t xml:space="preserve">Bracket notation: </w:t>
       </w:r>
-      <w:r>
-        <w:rPr>
-          <w:sz w:val="20"/>
-        </w:rPr>
-        <w:t>______________________________________________________________________</w:t>
-      </w:r>
     </w:p>
     <w:p>
       <w:pPr>
@@ -5197,7 +5149,7 @@
           <w:i/>
           <w:sz w:val="20"/>
         </w:rPr>
-        <w:t>Use SyntaxTreeHybrid to create your tree diagram. Paste or attach your PNG image below.</w:t>
+        <w:t>Please paste your diagram below.</w:t>
       </w:r>
     </w:p>
     <w:p>
@@ -5782,12 +5734,6 @@
         </w:rPr>
         <w:t xml:space="preserve">Bracket notation: </w:t>
       </w:r>
-      <w:r>
-        <w:rPr>
-          <w:sz w:val="20"/>
-        </w:rPr>
-        <w:t>______________________________________________________________________</w:t>
-      </w:r>
     </w:p>
     <w:p>
       <w:pPr>
@@ -5805,7 +5751,7 @@
           <w:i/>
           <w:sz w:val="20"/>
         </w:rPr>
-        <w:t>Use SyntaxTreeHybrid to create your tree diagram. Paste or attach your PNG image below.</w:t>
+        <w:t>Please paste your diagram below.</w:t>
       </w:r>
     </w:p>
     <w:p>
@@ -6361,12 +6307,6 @@
         </w:rPr>
         <w:t xml:space="preserve">Bracket notation: </w:t>
       </w:r>
-      <w:r>
-        <w:rPr>
-          <w:sz w:val="20"/>
-        </w:rPr>
-        <w:t>______________________________________________________________________</w:t>
-      </w:r>
     </w:p>
     <w:p>
       <w:pPr>
@@ -6384,7 +6324,7 @@
           <w:i/>
           <w:sz w:val="20"/>
         </w:rPr>
-        <w:t>Use SyntaxTreeHybrid to create your tree diagram. Paste or attach your PNG image below.</w:t>
+        <w:t>Please paste your diagram below.</w:t>
       </w:r>
     </w:p>
     <w:p>

</xml_diff>